<commit_message>
Update Latsar Materi Pengajar and Some fixes
</commit_message>
<xml_diff>
--- a/downloads/LAPORAN_PENYELENGGARAAN_LATSAR_CPNS_ANGKATAN_I_TAHUN_2025.docx
+++ b/downloads/LAPORAN_PENYELENGGARAAN_LATSAR_CPNS_ANGKATAN_I_TAHUN_2025.docx
@@ -60,7 +60,7 @@
           <w:smallCaps w:val="0"/>
           <w:caps w:val="1"/>
         </w:rPr>
-        <w:t xml:space="preserve">PELATIHAN DASAR CPNS ANGKATAN IV</w:t>
+        <w:t xml:space="preserve">PELATIHAN DASAR CPNS GOLONGAN III ANGKATAN 1 TAHUN 2025</w:t>
       </w:r>
     </w:p>
     <w:p>
@@ -124,7 +124,7 @@
           <w:sz w:val="24"/>
           <w:szCs w:val="24"/>
         </w:rPr>
-        <w:t xml:space="preserve">Puji dan syukur kehadirat Allah SWT, berkat rahmat serta karunianya, laporan Penyelenggaraan Pelatihan Dasar CPNS Angkatan IV di Wilayah Kerja Loka Pendidikan dan Pelatihan Keagamaan Pekanbaru ini telah dapat disusun.</w:t>
+        <w:t xml:space="preserve">Puji dan syukur kehadirat Allah SWT, berkat rahmat serta karunianya, laporan Penyelenggaraan Pelatihan Dasar CPNS Golongan III Angkatan 1 Tahun 2025 di Wilayah Kerja Loka Pendidikan dan Pelatihan Keagamaan Pekanbaru ini telah dapat disusun.</w:t>
       </w:r>
     </w:p>
     <w:p>
@@ -184,7 +184,7 @@
           <w:sz w:val="24"/>
           <w:szCs w:val="24"/>
         </w:rPr>
-        <w:t xml:space="preserve">Diharapkan bahwa dengan selesainya laporan ini, semua kegiatan yang berhubungan dengan Penyelenggaraan Pelatihan Dasar CPNS Angkatan IV dapat dipertanggungjawabkan.</w:t>
+        <w:t xml:space="preserve">Diharapkan bahwa dengan selesainya laporan ini, semua kegiatan yang berhubungan dengan Penyelenggaraan Pelatihan Dasar CPNS Golongan III Angkatan 1 Tahun 2025 dapat dipertanggungjawabkan.</w:t>
       </w:r>
     </w:p>
     <w:p/>
@@ -235,7 +235,7 @@
           <w:b w:val="1"/>
           <w:bCs w:val="1"/>
         </w:rPr>
-        <w:t xml:space="preserve">Eko Oktaviadi, S.H.</w:t>
+        <w:t xml:space="preserve">Suryandi, S.IP</w:t>
       </w:r>
     </w:p>
     <w:p>
@@ -251,7 +251,7 @@
           <w:b w:val="1"/>
           <w:bCs w:val="1"/>
         </w:rPr>
-        <w:t xml:space="preserve">NIP. 198210282009121005</w:t>
+        <w:t xml:space="preserve">NIP. 198107282009011018</w:t>
       </w:r>
     </w:p>
     <w:p>
@@ -945,7 +945,7 @@
           <w:sz w:val="24"/>
           <w:szCs w:val="24"/>
         </w:rPr>
-        <w:t xml:space="preserve">Sejalan dengan Peraturan Pemerintah Nomor 17 Tahun 2020 tentang perubahan atas Peraturan Pemerintah Nomor 11 Tahun 2017 tentang Manajemen Pegawai Negeri Sipil disebutkan bahwa CPNS wajib menjalani masa percobaan selama 1 tahun yang merupakan masa prajabatan. Selama masa prajabatan tersebut, CPNS wajib mengikuti pendidikan dan pelatihan atau yang lebih dikenal dengan sebutan Pelatihan Dasar. Oleh karena itu, pelaksanaan Pelatihan Dasar CPNS Golongan III Angkatan I pada tahun 2025 menjadi salah satu prioritas kegiatan yang harus dilaksanakan oleh Loka Pendidikan dan Pelatihan Keagamaan Pekanbaru. Pada pelaksanaan Pelatihan Dasar CPNS Golongan III Angkatan I pada tahun 2025, Balai Diklat Keagamaan Padang berperan sebagai lembaga penjaminan mutu.</w:t>
+        <w:t xml:space="preserve">Sejalan dengan Peraturan Pemerintah Nomor 17 Tahun 2020 tentang perubahan atas Peraturan Pemerintah Nomor 11 Tahun 2017 tentang Manajemen Pegawai Negeri Sipil disebutkan bahwa CPNS wajib menjalani masa percobaan selama 1 tahun yang merupakan masa prajabatan. Selama masa prajabatan tersebut, CPNS wajib mengikuti pendidikan dan pelatihan atau yang lebih dikenal dengan sebutan Pelatihan Dasar. Oleh karena itu, pelaksanaan {namaKegiatan} pada tahun 2025 menjadi salah satu prioritas kegiatan yang harus dilaksanakan oleh Loka Pendidikan dan Pelatihan Keagamaan Pekanbaru. Pada pelaksanaan {namaKegiatan} pada tahun 2025, Balai Diklat Keagamaan Padang berperan sebagai lembaga penjaminan mutu.</w:t>
       </w:r>
     </w:p>
     <w:p>
@@ -1228,7 +1228,7 @@
           <w:sz w:val="24"/>
           <w:szCs w:val="24"/>
         </w:rPr>
-        <w:t xml:space="preserve">Adapun peserta Pelatihan Dasar CPNS Golongan III Angkatan I berjumlah 40 peserta dengan rincian sebagai berikut:</w:t>
+        <w:t xml:space="preserve">Adapun peserta {namaKegiatan} berjumlah 40 peserta dengan rincian sebagai berikut:</w:t>
       </w:r>
     </w:p>
     <w:tbl>
@@ -1397,7 +1397,7 @@
             </w:pPr>
             <w:r>
               <w:rPr/>
-              <w:t xml:space="preserve">Abdul Chalim, S.Ag.</w:t>
+              <w:t xml:space="preserve">ABDAN SYAKURO, S.T.</w:t>
             </w:r>
           </w:p>
         </w:tc>
@@ -1412,7 +1412,7 @@
             </w:pPr>
             <w:r>
               <w:rPr/>
-              <w:t xml:space="preserve">199210252025051008.0</w:t>
+              <w:t xml:space="preserve">200102202025051001</w:t>
             </w:r>
           </w:p>
         </w:tc>
@@ -1427,7 +1427,7 @@
             </w:pPr>
             <w:r>
               <w:rPr/>
-              <w:t xml:space="preserve">III/a</w:t>
+              <w:t xml:space="preserve">III/A</w:t>
             </w:r>
           </w:p>
         </w:tc>
@@ -1442,22 +1442,22 @@
             </w:pPr>
             <w:r>
               <w:rPr/>
-              <w:t xml:space="preserve">Penghulu Ahli Pertama</w:t>
-            </w:r>
-          </w:p>
-        </w:tc>
-        <w:tc>
-          <w:tcPr>
-            <w:tcW w:w="3000" w:type="dxa"/>
-            <w:noWrap/>
-          </w:tcPr>
-          <w:p>
-            <w:pPr>
-              <w:jc w:val="left"/>
-            </w:pPr>
-            <w:r>
-              <w:rPr/>
-              <w:t xml:space="preserve">Kanwil Kementerian Agama Provinsi Riau</w:t>
+              <w:t xml:space="preserve">Pranata Komputer Ahli Pertama</w:t>
+            </w:r>
+          </w:p>
+        </w:tc>
+        <w:tc>
+          <w:tcPr>
+            <w:tcW w:w="3000" w:type="dxa"/>
+            <w:noWrap/>
+          </w:tcPr>
+          <w:p>
+            <w:pPr>
+              <w:jc w:val="left"/>
+            </w:pPr>
+            <w:r>
+              <w:rPr/>
+              <w:t xml:space="preserve">Loka Pendidikan Dan Pelatihan Keagamaan Pekanbaru</w:t>
             </w:r>
           </w:p>
         </w:tc>
@@ -1490,7 +1490,7 @@
             </w:pPr>
             <w:r>
               <w:rPr/>
-              <w:t xml:space="preserve">Abdur Rohman Zuhdi, S.H.</w:t>
+              <w:t xml:space="preserve">Bayu Sugara, S.T.</w:t>
             </w:r>
           </w:p>
         </w:tc>
@@ -1505,7 +1505,7 @@
             </w:pPr>
             <w:r>
               <w:rPr/>
-              <w:t xml:space="preserve">199510282025051008.0</w:t>
+              <w:t xml:space="preserve">199605262025051004</w:t>
             </w:r>
           </w:p>
         </w:tc>
@@ -1520,7 +1520,7 @@
             </w:pPr>
             <w:r>
               <w:rPr/>
-              <w:t xml:space="preserve">III/a</w:t>
+              <w:t xml:space="preserve">III/A</w:t>
             </w:r>
           </w:p>
         </w:tc>
@@ -1535,7 +1535,7 @@
             </w:pPr>
             <w:r>
               <w:rPr/>
-              <w:t xml:space="preserve">Penghulu Ahli Pertama</w:t>
+              <w:t xml:space="preserve">Pranata Komputer Ahli Pertama</w:t>
             </w:r>
           </w:p>
         </w:tc>
@@ -1583,7 +1583,7 @@
             </w:pPr>
             <w:r>
               <w:rPr/>
-              <w:t xml:space="preserve">Aidil Ahda, S.T.</w:t>
+              <w:t xml:space="preserve">Boni Iqbal</w:t>
             </w:r>
           </w:p>
         </w:tc>
@@ -1598,7 +1598,7 @@
             </w:pPr>
             <w:r>
               <w:rPr/>
-              <w:t xml:space="preserve">200109252025051008.0</w:t>
+              <w:t xml:space="preserve">199402152025051002</w:t>
             </w:r>
           </w:p>
         </w:tc>
@@ -1613,7 +1613,7 @@
             </w:pPr>
             <w:r>
               <w:rPr/>
-              <w:t xml:space="preserve">III/a</w:t>
+              <w:t xml:space="preserve">III/A</w:t>
             </w:r>
           </w:p>
         </w:tc>
@@ -1676,7 +1676,7 @@
             </w:pPr>
             <w:r>
               <w:rPr/>
-              <w:t xml:space="preserve">Alimin, S.Sos.</w:t>
+              <w:t xml:space="preserve">Christina Angela Girsang, S.Pd</w:t>
             </w:r>
           </w:p>
         </w:tc>
@@ -1691,7 +1691,7 @@
             </w:pPr>
             <w:r>
               <w:rPr/>
-              <w:t xml:space="preserve">199810122025051008.0</w:t>
+              <w:t xml:space="preserve">200111052025052004</w:t>
             </w:r>
           </w:p>
         </w:tc>
@@ -1706,7 +1706,7 @@
             </w:pPr>
             <w:r>
               <w:rPr/>
-              <w:t xml:space="preserve">III/a</w:t>
+              <w:t xml:space="preserve">III/A</w:t>
             </w:r>
           </w:p>
         </w:tc>
@@ -1721,7 +1721,7 @@
             </w:pPr>
             <w:r>
               <w:rPr/>
-              <w:t xml:space="preserve">Penghulu Ahli Pertama</w:t>
+              <w:t xml:space="preserve">Penyuluh Agama Ahli Pertama - Penyuluh Agama Katolik</w:t>
             </w:r>
           </w:p>
         </w:tc>
@@ -1769,7 +1769,7 @@
             </w:pPr>
             <w:r>
               <w:rPr/>
-              <w:t xml:space="preserve">Desi Ratna Sanjani, S.Pd.</w:t>
+              <w:t xml:space="preserve">DONI ABADI NABABAN, S.Pd</w:t>
             </w:r>
           </w:p>
         </w:tc>
@@ -1784,7 +1784,7 @@
             </w:pPr>
             <w:r>
               <w:rPr/>
-              <w:t xml:space="preserve">199412062025052000.0</w:t>
+              <w:t xml:space="preserve">199312292025051004</w:t>
             </w:r>
           </w:p>
         </w:tc>
@@ -1799,7 +1799,7 @@
             </w:pPr>
             <w:r>
               <w:rPr/>
-              <w:t xml:space="preserve">III/a</w:t>
+              <w:t xml:space="preserve">III/A</w:t>
             </w:r>
           </w:p>
         </w:tc>
@@ -1814,7 +1814,7 @@
             </w:pPr>
             <w:r>
               <w:rPr/>
-              <w:t xml:space="preserve">Guru Ahli Pertama  -  Guru Geografi</w:t>
+              <w:t xml:space="preserve">Penyuluh Agama Ahli Pertama - Penyuluh Agama Kristen</w:t>
             </w:r>
           </w:p>
         </w:tc>
@@ -1862,7 +1862,7 @@
             </w:pPr>
             <w:r>
               <w:rPr/>
-              <w:t xml:space="preserve">Dina Silvia, S.Ag.</w:t>
+              <w:t xml:space="preserve">Dr. HENDRI KRONIKO, M.Sy</w:t>
             </w:r>
           </w:p>
         </w:tc>
@@ -1877,7 +1877,7 @@
             </w:pPr>
             <w:r>
               <w:rPr/>
-              <w:t xml:space="preserve">200012192025052000.0</w:t>
+              <w:t xml:space="preserve">198907122025051001</w:t>
             </w:r>
           </w:p>
         </w:tc>
@@ -1892,7 +1892,7 @@
             </w:pPr>
             <w:r>
               <w:rPr/>
-              <w:t xml:space="preserve">III/a</w:t>
+              <w:t xml:space="preserve">III/c</w:t>
             </w:r>
           </w:p>
         </w:tc>
@@ -1907,22 +1907,22 @@
             </w:pPr>
             <w:r>
               <w:rPr/>
-              <w:t xml:space="preserve">Penyuluh Agama Islam Ahli Pertama</w:t>
-            </w:r>
-          </w:p>
-        </w:tc>
-        <w:tc>
-          <w:tcPr>
-            <w:tcW w:w="3000" w:type="dxa"/>
-            <w:noWrap/>
-          </w:tcPr>
-          <w:p>
-            <w:pPr>
-              <w:jc w:val="left"/>
-            </w:pPr>
-            <w:r>
-              <w:rPr/>
-              <w:t xml:space="preserve">Kanwil Kementerian Agama Provinsi Riau</w:t>
+              <w:t xml:space="preserve">Lektor</w:t>
+            </w:r>
+          </w:p>
+        </w:tc>
+        <w:tc>
+          <w:tcPr>
+            <w:tcW w:w="3000" w:type="dxa"/>
+            <w:noWrap/>
+          </w:tcPr>
+          <w:p>
+            <w:pPr>
+              <w:jc w:val="left"/>
+            </w:pPr>
+            <w:r>
+              <w:rPr/>
+              <w:t xml:space="preserve">Universitas Islam Negeri Sultan Syarif Kasim Riau</w:t>
             </w:r>
           </w:p>
         </w:tc>
@@ -1955,7 +1955,7 @@
             </w:pPr>
             <w:r>
               <w:rPr/>
-              <w:t xml:space="preserve">Ferry Ichsan Anwari, S.H.</w:t>
+              <w:t xml:space="preserve">Dr. ‌MUHAMMAD YASID, S.H., M.H</w:t>
             </w:r>
           </w:p>
         </w:tc>
@@ -1970,7 +1970,7 @@
             </w:pPr>
             <w:r>
               <w:rPr/>
-              <w:t xml:space="preserve">200008182025051008.0</w:t>
+              <w:t xml:space="preserve">198509112025051001</w:t>
             </w:r>
           </w:p>
         </w:tc>
@@ -1985,7 +1985,7 @@
             </w:pPr>
             <w:r>
               <w:rPr/>
-              <w:t xml:space="preserve">III/a</w:t>
+              <w:t xml:space="preserve">III/c</w:t>
             </w:r>
           </w:p>
         </w:tc>
@@ -2000,22 +2000,22 @@
             </w:pPr>
             <w:r>
               <w:rPr/>
-              <w:t xml:space="preserve">Penghulu Ahli Pertama</w:t>
-            </w:r>
-          </w:p>
-        </w:tc>
-        <w:tc>
-          <w:tcPr>
-            <w:tcW w:w="3000" w:type="dxa"/>
-            <w:noWrap/>
-          </w:tcPr>
-          <w:p>
-            <w:pPr>
-              <w:jc w:val="left"/>
-            </w:pPr>
-            <w:r>
-              <w:rPr/>
-              <w:t xml:space="preserve">Kanwil Kementerian Agama Provinsi Riau</w:t>
+              <w:t xml:space="preserve">Lektor</w:t>
+            </w:r>
+          </w:p>
+        </w:tc>
+        <w:tc>
+          <w:tcPr>
+            <w:tcW w:w="3000" w:type="dxa"/>
+            <w:noWrap/>
+          </w:tcPr>
+          <w:p>
+            <w:pPr>
+              <w:jc w:val="left"/>
+            </w:pPr>
+            <w:r>
+              <w:rPr/>
+              <w:t xml:space="preserve">Universitas Islam Negeri Sultan Syarif Kasim Riau</w:t>
             </w:r>
           </w:p>
         </w:tc>
@@ -2048,7 +2048,7 @@
             </w:pPr>
             <w:r>
               <w:rPr/>
-              <w:t xml:space="preserve">Habil Dela Fadzillah, S.S.I.</w:t>
+              <w:t xml:space="preserve">DR. ‌RIKO ANDRIAN, M.PD</w:t>
             </w:r>
           </w:p>
         </w:tc>
@@ -2063,7 +2063,7 @@
             </w:pPr>
             <w:r>
               <w:rPr/>
-              <w:t xml:space="preserve">200105222025051008.0</w:t>
+              <w:t xml:space="preserve">199306172025051002</w:t>
             </w:r>
           </w:p>
         </w:tc>
@@ -2078,7 +2078,7 @@
             </w:pPr>
             <w:r>
               <w:rPr/>
-              <w:t xml:space="preserve">III/a</w:t>
+              <w:t xml:space="preserve">III/c</w:t>
             </w:r>
           </w:p>
         </w:tc>
@@ -2093,22 +2093,22 @@
             </w:pPr>
             <w:r>
               <w:rPr/>
-              <w:t xml:space="preserve">Penghulu Ahli Pertama</w:t>
-            </w:r>
-          </w:p>
-        </w:tc>
-        <w:tc>
-          <w:tcPr>
-            <w:tcW w:w="3000" w:type="dxa"/>
-            <w:noWrap/>
-          </w:tcPr>
-          <w:p>
-            <w:pPr>
-              <w:jc w:val="left"/>
-            </w:pPr>
-            <w:r>
-              <w:rPr/>
-              <w:t xml:space="preserve">Kanwil Kementerian Agama Provinsi Riau</w:t>
+              <w:t xml:space="preserve">Lektor</w:t>
+            </w:r>
+          </w:p>
+        </w:tc>
+        <w:tc>
+          <w:tcPr>
+            <w:tcW w:w="3000" w:type="dxa"/>
+            <w:noWrap/>
+          </w:tcPr>
+          <w:p>
+            <w:pPr>
+              <w:jc w:val="left"/>
+            </w:pPr>
+            <w:r>
+              <w:rPr/>
+              <w:t xml:space="preserve">Universitas Islam Negeri Sultan Syarif Kasim Riau</w:t>
             </w:r>
           </w:p>
         </w:tc>
@@ -2141,7 +2141,7 @@
             </w:pPr>
             <w:r>
               <w:rPr/>
-              <w:t xml:space="preserve">Halimatusyakdiyah, S.E.</w:t>
+              <w:t xml:space="preserve">D‌r. IRPAN APANDI BATUBARA, S.Pd., M.S.</w:t>
             </w:r>
           </w:p>
         </w:tc>
@@ -2156,7 +2156,7 @@
             </w:pPr>
             <w:r>
               <w:rPr/>
-              <w:t xml:space="preserve">199404182025052000.0</w:t>
+              <w:t xml:space="preserve">198605122025051001</w:t>
             </w:r>
           </w:p>
         </w:tc>
@@ -2171,7 +2171,7 @@
             </w:pPr>
             <w:r>
               <w:rPr/>
-              <w:t xml:space="preserve">III/a</w:t>
+              <w:t xml:space="preserve">III/c</w:t>
             </w:r>
           </w:p>
         </w:tc>
@@ -2186,22 +2186,22 @@
             </w:pPr>
             <w:r>
               <w:rPr/>
-              <w:t xml:space="preserve">Pengelola Pengadaan Barang dan Jasa Ahli Pertama</w:t>
-            </w:r>
-          </w:p>
-        </w:tc>
-        <w:tc>
-          <w:tcPr>
-            <w:tcW w:w="3000" w:type="dxa"/>
-            <w:noWrap/>
-          </w:tcPr>
-          <w:p>
-            <w:pPr>
-              <w:jc w:val="left"/>
-            </w:pPr>
-            <w:r>
-              <w:rPr/>
-              <w:t xml:space="preserve">Kanwil Kementerian Agama Provinsi Riau</w:t>
+              <w:t xml:space="preserve">Lektor</w:t>
+            </w:r>
+          </w:p>
+        </w:tc>
+        <w:tc>
+          <w:tcPr>
+            <w:tcW w:w="3000" w:type="dxa"/>
+            <w:noWrap/>
+          </w:tcPr>
+          <w:p>
+            <w:pPr>
+              <w:jc w:val="left"/>
+            </w:pPr>
+            <w:r>
+              <w:rPr/>
+              <w:t xml:space="preserve">Universitas Islam Negeri Sultan Syarif Kasim Riau</w:t>
             </w:r>
           </w:p>
         </w:tc>
@@ -2234,7 +2234,7 @@
             </w:pPr>
             <w:r>
               <w:rPr/>
-              <w:t xml:space="preserve">Hendra Tedy Kurniawan, S.Ag.</w:t>
+              <w:t xml:space="preserve">Ezza wilona caulica</w:t>
             </w:r>
           </w:p>
         </w:tc>
@@ -2249,7 +2249,7 @@
             </w:pPr>
             <w:r>
               <w:rPr/>
-              <w:t xml:space="preserve">199905052025051008.0</w:t>
+              <w:t xml:space="preserve">199003072025052003</w:t>
             </w:r>
           </w:p>
         </w:tc>
@@ -2264,7 +2264,7 @@
             </w:pPr>
             <w:r>
               <w:rPr/>
-              <w:t xml:space="preserve">III/a</w:t>
+              <w:t xml:space="preserve">III/A</w:t>
             </w:r>
           </w:p>
         </w:tc>
@@ -2279,7 +2279,7 @@
             </w:pPr>
             <w:r>
               <w:rPr/>
-              <w:t xml:space="preserve">Penghulu Ahli Pertama</w:t>
+              <w:t xml:space="preserve">Pranata Komputer</w:t>
             </w:r>
           </w:p>
         </w:tc>
@@ -2327,7 +2327,7 @@
             </w:pPr>
             <w:r>
               <w:rPr/>
-              <w:t xml:space="preserve">Ikhwanul Arif, S.Ag.</w:t>
+              <w:t xml:space="preserve">FAUZAN OCTHORY LUKFI, S.T</w:t>
             </w:r>
           </w:p>
         </w:tc>
@@ -2342,7 +2342,7 @@
             </w:pPr>
             <w:r>
               <w:rPr/>
-              <w:t xml:space="preserve">199909132025051008.0</w:t>
+              <w:t xml:space="preserve">199810062025051006</w:t>
             </w:r>
           </w:p>
         </w:tc>
@@ -2357,7 +2357,7 @@
             </w:pPr>
             <w:r>
               <w:rPr/>
-              <w:t xml:space="preserve">III/a</w:t>
+              <w:t xml:space="preserve">III/A</w:t>
             </w:r>
           </w:p>
         </w:tc>
@@ -2372,7 +2372,7 @@
             </w:pPr>
             <w:r>
               <w:rPr/>
-              <w:t xml:space="preserve">Penghulu Ahli Pertama</w:t>
+              <w:t xml:space="preserve">Pranata Komputer Ahli Pertama</w:t>
             </w:r>
           </w:p>
         </w:tc>
@@ -2420,7 +2420,7 @@
             </w:pPr>
             <w:r>
               <w:rPr/>
-              <w:t xml:space="preserve">Imam Sobirin, S.H.</w:t>
+              <w:t xml:space="preserve">Harisah 'Aini Auliya, S.IP., M.Si</w:t>
             </w:r>
           </w:p>
         </w:tc>
@@ -2435,7 +2435,7 @@
             </w:pPr>
             <w:r>
               <w:rPr/>
-              <w:t xml:space="preserve">199505172025051008.0</w:t>
+              <w:t xml:space="preserve">199507082025052005</w:t>
             </w:r>
           </w:p>
         </w:tc>
@@ -2450,7 +2450,7 @@
             </w:pPr>
             <w:r>
               <w:rPr/>
-              <w:t xml:space="preserve">III/a</w:t>
+              <w:t xml:space="preserve">III/A</w:t>
             </w:r>
           </w:p>
         </w:tc>
@@ -2465,7 +2465,7 @@
             </w:pPr>
             <w:r>
               <w:rPr/>
-              <w:t xml:space="preserve">Penghulu Ahli Pertama</w:t>
+              <w:t xml:space="preserve">Pranata Hubungan Masyarakat Ahli Pertama</w:t>
             </w:r>
           </w:p>
         </w:tc>
@@ -2513,7 +2513,7 @@
             </w:pPr>
             <w:r>
               <w:rPr/>
-              <w:t xml:space="preserve">Irfan Islami, S.Pd.</w:t>
+              <w:t xml:space="preserve">JUNI ARDHI, S.Pd.B.</w:t>
             </w:r>
           </w:p>
         </w:tc>
@@ -2528,7 +2528,7 @@
             </w:pPr>
             <w:r>
               <w:rPr/>
-              <w:t xml:space="preserve">199106012025051008.0</w:t>
+              <w:t xml:space="preserve">199106252025051002</w:t>
             </w:r>
           </w:p>
         </w:tc>
@@ -2543,7 +2543,7 @@
             </w:pPr>
             <w:r>
               <w:rPr/>
-              <w:t xml:space="preserve">III/a</w:t>
+              <w:t xml:space="preserve">III/A</w:t>
             </w:r>
           </w:p>
         </w:tc>
@@ -2558,7 +2558,7 @@
             </w:pPr>
             <w:r>
               <w:rPr/>
-              <w:t xml:space="preserve">Guru Ahli Pertama  -  GURU PENJASORKES</w:t>
+              <w:t xml:space="preserve">Penyuluh Agama Ahli Pertama - Penyuluh Agama Buddha</w:t>
             </w:r>
           </w:p>
         </w:tc>
@@ -2606,7 +2606,7 @@
             </w:pPr>
             <w:r>
               <w:rPr/>
-              <w:t xml:space="preserve">Irma Khairunnisak, S.Pd.</w:t>
+              <w:t xml:space="preserve">M.Ag</w:t>
             </w:r>
           </w:p>
         </w:tc>
@@ -2621,7 +2621,7 @@
             </w:pPr>
             <w:r>
               <w:rPr/>
-              <w:t xml:space="preserve">200102122025052000.0</w:t>
+              <w:t xml:space="preserve">199511142025051004</w:t>
             </w:r>
           </w:p>
         </w:tc>
@@ -2636,7 +2636,7 @@
             </w:pPr>
             <w:r>
               <w:rPr/>
-              <w:t xml:space="preserve">III/a</w:t>
+              <w:t xml:space="preserve">III/b</w:t>
             </w:r>
           </w:p>
         </w:tc>
@@ -2651,22 +2651,22 @@
             </w:pPr>
             <w:r>
               <w:rPr/>
-              <w:t xml:space="preserve">Guru Ahli Pertama  -  Guru Kimia</w:t>
-            </w:r>
-          </w:p>
-        </w:tc>
-        <w:tc>
-          <w:tcPr>
-            <w:tcW w:w="3000" w:type="dxa"/>
-            <w:noWrap/>
-          </w:tcPr>
-          <w:p>
-            <w:pPr>
-              <w:jc w:val="left"/>
-            </w:pPr>
-            <w:r>
-              <w:rPr/>
-              <w:t xml:space="preserve">Kanwil Kementerian Agama Provinsi Riau</w:t>
+              <w:t xml:space="preserve">Asisten Ahli</w:t>
+            </w:r>
+          </w:p>
+        </w:tc>
+        <w:tc>
+          <w:tcPr>
+            <w:tcW w:w="3000" w:type="dxa"/>
+            <w:noWrap/>
+          </w:tcPr>
+          <w:p>
+            <w:pPr>
+              <w:jc w:val="left"/>
+            </w:pPr>
+            <w:r>
+              <w:rPr/>
+              <w:t xml:space="preserve">Universitas Islam Negeri Sultan Syarif Kasim Riau</w:t>
             </w:r>
           </w:p>
         </w:tc>
@@ -2699,7 +2699,7 @@
             </w:pPr>
             <w:r>
               <w:rPr/>
-              <w:t xml:space="preserve">Irnandianis Ika Pratiwi, S.Pd.</w:t>
+              <w:t xml:space="preserve">MUHAMMAD FAUZI FAYYAD. S.Kom.</w:t>
             </w:r>
           </w:p>
         </w:tc>
@@ -2714,7 +2714,7 @@
             </w:pPr>
             <w:r>
               <w:rPr/>
-              <w:t xml:space="preserve">200009022025052000.0</w:t>
+              <w:t xml:space="preserve">199912192025051003</w:t>
             </w:r>
           </w:p>
         </w:tc>
@@ -2729,7 +2729,7 @@
             </w:pPr>
             <w:r>
               <w:rPr/>
-              <w:t xml:space="preserve">III/a</w:t>
+              <w:t xml:space="preserve">III/A</w:t>
             </w:r>
           </w:p>
         </w:tc>
@@ -2744,22 +2744,22 @@
             </w:pPr>
             <w:r>
               <w:rPr/>
-              <w:t xml:space="preserve">Guru Ahli Pertama  -  Guru IPS</w:t>
-            </w:r>
-          </w:p>
-        </w:tc>
-        <w:tc>
-          <w:tcPr>
-            <w:tcW w:w="3000" w:type="dxa"/>
-            <w:noWrap/>
-          </w:tcPr>
-          <w:p>
-            <w:pPr>
-              <w:jc w:val="left"/>
-            </w:pPr>
-            <w:r>
-              <w:rPr/>
-              <w:t xml:space="preserve">Kanwil Kementerian Agama Provinsi Riau</w:t>
+              <w:t xml:space="preserve">Pranata Komputer Ahli Pertama</w:t>
+            </w:r>
+          </w:p>
+        </w:tc>
+        <w:tc>
+          <w:tcPr>
+            <w:tcW w:w="3000" w:type="dxa"/>
+            <w:noWrap/>
+          </w:tcPr>
+          <w:p>
+            <w:pPr>
+              <w:jc w:val="left"/>
+            </w:pPr>
+            <w:r>
+              <w:rPr/>
+              <w:t xml:space="preserve">Loka Pendidikan Dan Pelatihan Keagamaan Pekanbaru</w:t>
             </w:r>
           </w:p>
         </w:tc>
@@ -2792,7 +2792,7 @@
             </w:pPr>
             <w:r>
               <w:rPr/>
-              <w:t xml:space="preserve">Jeihan Adib Alperez, S.Pd.</w:t>
+              <w:t xml:space="preserve">Narendra Benny, S.Kom</w:t>
             </w:r>
           </w:p>
         </w:tc>
@@ -2807,7 +2807,7 @@
             </w:pPr>
             <w:r>
               <w:rPr/>
-              <w:t xml:space="preserve">199612282025051008.0</w:t>
+              <w:t xml:space="preserve">199503032025051007</w:t>
             </w:r>
           </w:p>
         </w:tc>
@@ -2822,7 +2822,7 @@
             </w:pPr>
             <w:r>
               <w:rPr/>
-              <w:t xml:space="preserve">III/a</w:t>
+              <w:t xml:space="preserve">III/A</w:t>
             </w:r>
           </w:p>
         </w:tc>
@@ -2837,7 +2837,7 @@
             </w:pPr>
             <w:r>
               <w:rPr/>
-              <w:t xml:space="preserve">Ahli Pertama  /  Guru IPA</w:t>
+              <w:t xml:space="preserve">Pranata Komputer Ahli Pertama</w:t>
             </w:r>
           </w:p>
         </w:tc>
@@ -2885,7 +2885,7 @@
             </w:pPr>
             <w:r>
               <w:rPr/>
-              <w:t xml:space="preserve">Junaidi, S.H.</w:t>
+              <w:t xml:space="preserve">Norman, S.T.</w:t>
             </w:r>
           </w:p>
         </w:tc>
@@ -2900,7 +2900,7 @@
             </w:pPr>
             <w:r>
               <w:rPr/>
-              <w:t xml:space="preserve">199406042025051008.0</w:t>
+              <w:t xml:space="preserve">199912112025051010</w:t>
             </w:r>
           </w:p>
         </w:tc>
@@ -2915,7 +2915,7 @@
             </w:pPr>
             <w:r>
               <w:rPr/>
-              <w:t xml:space="preserve">III/a</w:t>
+              <w:t xml:space="preserve">III/A</w:t>
             </w:r>
           </w:p>
         </w:tc>
@@ -2930,7 +2930,7 @@
             </w:pPr>
             <w:r>
               <w:rPr/>
-              <w:t xml:space="preserve">Penghulu Ahli Pertama</w:t>
+              <w:t xml:space="preserve">Pranata Komputer Ahli Pertama</w:t>
             </w:r>
           </w:p>
         </w:tc>
@@ -2978,7 +2978,7 @@
             </w:pPr>
             <w:r>
               <w:rPr/>
-              <w:t xml:space="preserve">Khalil Fajri, S.Ag.</w:t>
+              <w:t xml:space="preserve">RISMA NURDIANA, S.Sos</w:t>
             </w:r>
           </w:p>
         </w:tc>
@@ -2993,7 +2993,7 @@
             </w:pPr>
             <w:r>
               <w:rPr/>
-              <w:t xml:space="preserve">199802172025051008.0</w:t>
+              <w:t xml:space="preserve">200009202025052008</w:t>
             </w:r>
           </w:p>
         </w:tc>
@@ -3008,7 +3008,7 @@
             </w:pPr>
             <w:r>
               <w:rPr/>
-              <w:t xml:space="preserve">III/a</w:t>
+              <w:t xml:space="preserve">III/A</w:t>
             </w:r>
           </w:p>
         </w:tc>
@@ -3023,22 +3023,22 @@
             </w:pPr>
             <w:r>
               <w:rPr/>
-              <w:t xml:space="preserve">Penghulu Ahli Pertama</w:t>
-            </w:r>
-          </w:p>
-        </w:tc>
-        <w:tc>
-          <w:tcPr>
-            <w:tcW w:w="3000" w:type="dxa"/>
-            <w:noWrap/>
-          </w:tcPr>
-          <w:p>
-            <w:pPr>
-              <w:jc w:val="left"/>
-            </w:pPr>
-            <w:r>
-              <w:rPr/>
-              <w:t xml:space="preserve">Kanwil Kementerian Agama Provinsi Riau</w:t>
+              <w:t xml:space="preserve">Pranata Hubungan Masyarakat Ahli Pertama</w:t>
+            </w:r>
+          </w:p>
+        </w:tc>
+        <w:tc>
+          <w:tcPr>
+            <w:tcW w:w="3000" w:type="dxa"/>
+            <w:noWrap/>
+          </w:tcPr>
+          <w:p>
+            <w:pPr>
+              <w:jc w:val="left"/>
+            </w:pPr>
+            <w:r>
+              <w:rPr/>
+              <w:t xml:space="preserve">Loka Pendidikan Dan Pelatihan Keagamaan Pekanbaru</w:t>
             </w:r>
           </w:p>
         </w:tc>
@@ -3071,7 +3071,7 @@
             </w:pPr>
             <w:r>
               <w:rPr/>
-              <w:t xml:space="preserve">M Abdul Jalil, S.H.</w:t>
+              <w:t xml:space="preserve">SHINTA ELVITA BELLA</w:t>
             </w:r>
           </w:p>
         </w:tc>
@@ -3086,7 +3086,7 @@
             </w:pPr>
             <w:r>
               <w:rPr/>
-              <w:t xml:space="preserve">199706162025051008.0</w:t>
+              <w:t xml:space="preserve">199805232025052009</w:t>
             </w:r>
           </w:p>
         </w:tc>
@@ -3101,7 +3101,7 @@
             </w:pPr>
             <w:r>
               <w:rPr/>
-              <w:t xml:space="preserve">III/a</w:t>
+              <w:t xml:space="preserve">III/A</w:t>
             </w:r>
           </w:p>
         </w:tc>
@@ -3116,7 +3116,7 @@
             </w:pPr>
             <w:r>
               <w:rPr/>
-              <w:t xml:space="preserve">Penghulu Ahli Pertama</w:t>
+              <w:t xml:space="preserve">Pengawas Jaminan Produk Halal</w:t>
             </w:r>
           </w:p>
         </w:tc>
@@ -3164,7 +3164,7 @@
             </w:pPr>
             <w:r>
               <w:rPr/>
-              <w:t xml:space="preserve">M. Amirur Rahman, S.Ag.</w:t>
+              <w:t xml:space="preserve">Taufiq Qurahman, S.Kom</w:t>
             </w:r>
           </w:p>
         </w:tc>
@@ -3179,7 +3179,7 @@
             </w:pPr>
             <w:r>
               <w:rPr/>
-              <w:t xml:space="preserve">200005152025051008.0</w:t>
+              <w:t xml:space="preserve">199708102025051007</w:t>
             </w:r>
           </w:p>
         </w:tc>
@@ -3194,7 +3194,7 @@
             </w:pPr>
             <w:r>
               <w:rPr/>
-              <w:t xml:space="preserve">III/a</w:t>
+              <w:t xml:space="preserve">III/A</w:t>
             </w:r>
           </w:p>
         </w:tc>
@@ -3209,7 +3209,7 @@
             </w:pPr>
             <w:r>
               <w:rPr/>
-              <w:t xml:space="preserve">Penghulu Ahli Pertama</w:t>
+              <w:t xml:space="preserve">Pranata Komputer Ahli Pertama</w:t>
             </w:r>
           </w:p>
         </w:tc>
@@ -3257,7 +3257,7 @@
             </w:pPr>
             <w:r>
               <w:rPr/>
-              <w:t xml:space="preserve">M. Andri Damara, S.Pd.</w:t>
+              <w:t xml:space="preserve">Yola Zulyenni, S.H.</w:t>
             </w:r>
           </w:p>
         </w:tc>
@@ -3272,7 +3272,7 @@
             </w:pPr>
             <w:r>
               <w:rPr/>
-              <w:t xml:space="preserve">199905062025051008.0</w:t>
+              <w:t xml:space="preserve">199810092025052007</w:t>
             </w:r>
           </w:p>
         </w:tc>
@@ -3287,7 +3287,7 @@
             </w:pPr>
             <w:r>
               <w:rPr/>
-              <w:t xml:space="preserve">III/a</w:t>
+              <w:t xml:space="preserve">III/A</w:t>
             </w:r>
           </w:p>
         </w:tc>
@@ -3302,7 +3302,7 @@
             </w:pPr>
             <w:r>
               <w:rPr/>
-              <w:t xml:space="preserve">Guru Ahli Pertama  /  Guru Bahasa Arab</w:t>
+              <w:t xml:space="preserve">Analis Hukum Ahli Pertama</w:t>
             </w:r>
           </w:p>
         </w:tc>
@@ -3350,7 +3350,7 @@
             </w:pPr>
             <w:r>
               <w:rPr/>
-              <w:t xml:space="preserve">M. Muaddib Qomarsyah, B.A.</w:t>
+              <w:t xml:space="preserve">Yulia Safitri, S.Ak</w:t>
             </w:r>
           </w:p>
         </w:tc>
@@ -3365,7 +3365,7 @@
             </w:pPr>
             <w:r>
               <w:rPr/>
-              <w:t xml:space="preserve">199710162025051008.0</w:t>
+              <w:t xml:space="preserve">200207032025052006</w:t>
             </w:r>
           </w:p>
         </w:tc>
@@ -3380,7 +3380,7 @@
             </w:pPr>
             <w:r>
               <w:rPr/>
-              <w:t xml:space="preserve">III/a</w:t>
+              <w:t xml:space="preserve">III/A</w:t>
             </w:r>
           </w:p>
         </w:tc>
@@ -3395,7 +3395,7 @@
             </w:pPr>
             <w:r>
               <w:rPr/>
-              <w:t xml:space="preserve">Pengawas Jaminan Produk Halal  /  Ahli Pertama</w:t>
+              <w:t xml:space="preserve">Pengelola Pengadaan Barang Jasa Ahli Pertama</w:t>
             </w:r>
           </w:p>
         </w:tc>
@@ -3443,7 +3443,7 @@
             </w:pPr>
             <w:r>
               <w:rPr/>
-              <w:t xml:space="preserve">M. Rezi Muda Putra, S.Ag.</w:t>
+              <w:t xml:space="preserve">‌ADHI MUNAJAR, M.Pd.</w:t>
             </w:r>
           </w:p>
         </w:tc>
@@ -3458,7 +3458,7 @@
             </w:pPr>
             <w:r>
               <w:rPr/>
-              <w:t xml:space="preserve">200008062025051008.0</w:t>
+              <w:t xml:space="preserve">199112292025051001</w:t>
             </w:r>
           </w:p>
         </w:tc>
@@ -3473,7 +3473,7 @@
             </w:pPr>
             <w:r>
               <w:rPr/>
-              <w:t xml:space="preserve">III/a</w:t>
+              <w:t xml:space="preserve">III/b</w:t>
             </w:r>
           </w:p>
         </w:tc>
@@ -3488,22 +3488,22 @@
             </w:pPr>
             <w:r>
               <w:rPr/>
-              <w:t xml:space="preserve">Penghulu Ahli Pertama</w:t>
-            </w:r>
-          </w:p>
-        </w:tc>
-        <w:tc>
-          <w:tcPr>
-            <w:tcW w:w="3000" w:type="dxa"/>
-            <w:noWrap/>
-          </w:tcPr>
-          <w:p>
-            <w:pPr>
-              <w:jc w:val="left"/>
-            </w:pPr>
-            <w:r>
-              <w:rPr/>
-              <w:t xml:space="preserve">Kanwil Kementerian Agama Provinsi Riau</w:t>
+              <w:t xml:space="preserve">Asisten Ahli</w:t>
+            </w:r>
+          </w:p>
+        </w:tc>
+        <w:tc>
+          <w:tcPr>
+            <w:tcW w:w="3000" w:type="dxa"/>
+            <w:noWrap/>
+          </w:tcPr>
+          <w:p>
+            <w:pPr>
+              <w:jc w:val="left"/>
+            </w:pPr>
+            <w:r>
+              <w:rPr/>
+              <w:t xml:space="preserve">Universitas Islam Negeri Sultan Syarif Kasim Riau</w:t>
             </w:r>
           </w:p>
         </w:tc>
@@ -3536,7 +3536,7 @@
             </w:pPr>
             <w:r>
               <w:rPr/>
-              <w:t xml:space="preserve">M. Zainudin, S.Ag.</w:t>
+              <w:t xml:space="preserve">‌AGUNG KURNIAWAN, S.Kom.</w:t>
             </w:r>
           </w:p>
         </w:tc>
@@ -3551,7 +3551,7 @@
             </w:pPr>
             <w:r>
               <w:rPr/>
-              <w:t xml:space="preserve">200101222025051008.0</w:t>
+              <w:t xml:space="preserve">199706252025051005</w:t>
             </w:r>
           </w:p>
         </w:tc>
@@ -3566,7 +3566,7 @@
             </w:pPr>
             <w:r>
               <w:rPr/>
-              <w:t xml:space="preserve">III/a</w:t>
+              <w:t xml:space="preserve">III/A</w:t>
             </w:r>
           </w:p>
         </w:tc>
@@ -3581,22 +3581,22 @@
             </w:pPr>
             <w:r>
               <w:rPr/>
-              <w:t xml:space="preserve">Penghulu Ahli Pertama</w:t>
-            </w:r>
-          </w:p>
-        </w:tc>
-        <w:tc>
-          <w:tcPr>
-            <w:tcW w:w="3000" w:type="dxa"/>
-            <w:noWrap/>
-          </w:tcPr>
-          <w:p>
-            <w:pPr>
-              <w:jc w:val="left"/>
-            </w:pPr>
-            <w:r>
-              <w:rPr/>
-              <w:t xml:space="preserve">Kanwil Kementerian Agama Provinsi Riau</w:t>
+              <w:t xml:space="preserve">Pranata Komputer Ahli Pertama</w:t>
+            </w:r>
+          </w:p>
+        </w:tc>
+        <w:tc>
+          <w:tcPr>
+            <w:tcW w:w="3000" w:type="dxa"/>
+            <w:noWrap/>
+          </w:tcPr>
+          <w:p>
+            <w:pPr>
+              <w:jc w:val="left"/>
+            </w:pPr>
+            <w:r>
+              <w:rPr/>
+              <w:t xml:space="preserve">Universitas Islam Negeri Sultan Syarif Kasim Riau</w:t>
             </w:r>
           </w:p>
         </w:tc>
@@ -3629,7 +3629,7 @@
             </w:pPr>
             <w:r>
               <w:rPr/>
-              <w:t xml:space="preserve">Mhd Cahyadi Rustak, S.Sos.</w:t>
+              <w:t xml:space="preserve">‌AHMAD MAKMUN KHODORI, S.Ag, M.A</w:t>
             </w:r>
           </w:p>
         </w:tc>
@@ -3644,7 +3644,7 @@
             </w:pPr>
             <w:r>
               <w:rPr/>
-              <w:t xml:space="preserve">199907192025051008.0</w:t>
+              <w:t xml:space="preserve">199804302025051005</w:t>
             </w:r>
           </w:p>
         </w:tc>
@@ -3659,7 +3659,7 @@
             </w:pPr>
             <w:r>
               <w:rPr/>
-              <w:t xml:space="preserve">III/a</w:t>
+              <w:t xml:space="preserve">III/b</w:t>
             </w:r>
           </w:p>
         </w:tc>
@@ -3674,22 +3674,22 @@
             </w:pPr>
             <w:r>
               <w:rPr/>
-              <w:t xml:space="preserve">Penghulu Ahli Pertama</w:t>
-            </w:r>
-          </w:p>
-        </w:tc>
-        <w:tc>
-          <w:tcPr>
-            <w:tcW w:w="3000" w:type="dxa"/>
-            <w:noWrap/>
-          </w:tcPr>
-          <w:p>
-            <w:pPr>
-              <w:jc w:val="left"/>
-            </w:pPr>
-            <w:r>
-              <w:rPr/>
-              <w:t xml:space="preserve">Kanwil Kementerian Agama Provinsi Kepulauan Riau</w:t>
+              <w:t xml:space="preserve">Asisten Ahli</w:t>
+            </w:r>
+          </w:p>
+        </w:tc>
+        <w:tc>
+          <w:tcPr>
+            <w:tcW w:w="3000" w:type="dxa"/>
+            <w:noWrap/>
+          </w:tcPr>
+          <w:p>
+            <w:pPr>
+              <w:jc w:val="left"/>
+            </w:pPr>
+            <w:r>
+              <w:rPr/>
+              <w:t xml:space="preserve">Universitas Islam Negeri Sultan Syarif Kasim Riau</w:t>
             </w:r>
           </w:p>
         </w:tc>
@@ -3722,7 +3722,7 @@
             </w:pPr>
             <w:r>
               <w:rPr/>
-              <w:t xml:space="preserve">Mitra Frecilia Neldi, S.Si.</w:t>
+              <w:t xml:space="preserve">‌ARIEF BUDIMAN S.H.,M.H</w:t>
             </w:r>
           </w:p>
         </w:tc>
@@ -3737,7 +3737,7 @@
             </w:pPr>
             <w:r>
               <w:rPr/>
-              <w:t xml:space="preserve">200006252025052000.0</w:t>
+              <w:t xml:space="preserve">199804222025051007</w:t>
             </w:r>
           </w:p>
         </w:tc>
@@ -3752,7 +3752,7 @@
             </w:pPr>
             <w:r>
               <w:rPr/>
-              <w:t xml:space="preserve">III/a</w:t>
+              <w:t xml:space="preserve">III/b</w:t>
             </w:r>
           </w:p>
         </w:tc>
@@ -3767,22 +3767,22 @@
             </w:pPr>
             <w:r>
               <w:rPr/>
-              <w:t xml:space="preserve">Pengelola Pengadaan Barang  /  Jasa Ahli Pertama</w:t>
-            </w:r>
-          </w:p>
-        </w:tc>
-        <w:tc>
-          <w:tcPr>
-            <w:tcW w:w="3000" w:type="dxa"/>
-            <w:noWrap/>
-          </w:tcPr>
-          <w:p>
-            <w:pPr>
-              <w:jc w:val="left"/>
-            </w:pPr>
-            <w:r>
-              <w:rPr/>
-              <w:t xml:space="preserve">Kanwil Kementerian Agama Provinsi Riau</w:t>
+              <w:t xml:space="preserve">Asisten Ahli</w:t>
+            </w:r>
+          </w:p>
+        </w:tc>
+        <w:tc>
+          <w:tcPr>
+            <w:tcW w:w="3000" w:type="dxa"/>
+            <w:noWrap/>
+          </w:tcPr>
+          <w:p>
+            <w:pPr>
+              <w:jc w:val="left"/>
+            </w:pPr>
+            <w:r>
+              <w:rPr/>
+              <w:t xml:space="preserve">Universitas Islam Negeri Sultan Syarif Kasim Riau</w:t>
             </w:r>
           </w:p>
         </w:tc>
@@ -3815,7 +3815,7 @@
             </w:pPr>
             <w:r>
               <w:rPr/>
-              <w:t xml:space="preserve">Muhamad Nasrullah, S.Ag.</w:t>
+              <w:t xml:space="preserve">‌AZHARI ANDI, M.Ag</w:t>
             </w:r>
           </w:p>
         </w:tc>
@@ -3830,7 +3830,7 @@
             </w:pPr>
             <w:r>
               <w:rPr/>
-              <w:t xml:space="preserve">200105252025051008.0</w:t>
+              <w:t xml:space="preserve">199509182025051004</w:t>
             </w:r>
           </w:p>
         </w:tc>
@@ -3845,7 +3845,7 @@
             </w:pPr>
             <w:r>
               <w:rPr/>
-              <w:t xml:space="preserve">III/a</w:t>
+              <w:t xml:space="preserve">III/b</w:t>
             </w:r>
           </w:p>
         </w:tc>
@@ -3860,22 +3860,22 @@
             </w:pPr>
             <w:r>
               <w:rPr/>
-              <w:t xml:space="preserve">Penghulu Ahli Pertama</w:t>
-            </w:r>
-          </w:p>
-        </w:tc>
-        <w:tc>
-          <w:tcPr>
-            <w:tcW w:w="3000" w:type="dxa"/>
-            <w:noWrap/>
-          </w:tcPr>
-          <w:p>
-            <w:pPr>
-              <w:jc w:val="left"/>
-            </w:pPr>
-            <w:r>
-              <w:rPr/>
-              <w:t xml:space="preserve">Kanwil Kementerian Agama Provinsi Riau</w:t>
+              <w:t xml:space="preserve">Asisten Ahli</w:t>
+            </w:r>
+          </w:p>
+        </w:tc>
+        <w:tc>
+          <w:tcPr>
+            <w:tcW w:w="3000" w:type="dxa"/>
+            <w:noWrap/>
+          </w:tcPr>
+          <w:p>
+            <w:pPr>
+              <w:jc w:val="left"/>
+            </w:pPr>
+            <w:r>
+              <w:rPr/>
+              <w:t xml:space="preserve">Universitas Islam Negeri Sultan Syarif Kasim Riau</w:t>
             </w:r>
           </w:p>
         </w:tc>
@@ -3908,7 +3908,7 @@
             </w:pPr>
             <w:r>
               <w:rPr/>
-              <w:t xml:space="preserve">Muhammad Adiatma, S.Pd.I.</w:t>
+              <w:t xml:space="preserve">‌Dr. KIKI HARDIANSYAH SIREGAR, S.Pd., M.Pd.</w:t>
             </w:r>
           </w:p>
         </w:tc>
@@ -3923,7 +3923,7 @@
             </w:pPr>
             <w:r>
               <w:rPr/>
-              <w:t xml:space="preserve">199304172025051008.0</w:t>
+              <w:t xml:space="preserve">198610172025051001</w:t>
             </w:r>
           </w:p>
         </w:tc>
@@ -3938,7 +3938,7 @@
             </w:pPr>
             <w:r>
               <w:rPr/>
-              <w:t xml:space="preserve">III/a</w:t>
+              <w:t xml:space="preserve">III/c</w:t>
             </w:r>
           </w:p>
         </w:tc>
@@ -3953,22 +3953,22 @@
             </w:pPr>
             <w:r>
               <w:rPr/>
-              <w:t xml:space="preserve">Guru Ahli Pertama</w:t>
-            </w:r>
-          </w:p>
-        </w:tc>
-        <w:tc>
-          <w:tcPr>
-            <w:tcW w:w="3000" w:type="dxa"/>
-            <w:noWrap/>
-          </w:tcPr>
-          <w:p>
-            <w:pPr>
-              <w:jc w:val="left"/>
-            </w:pPr>
-            <w:r>
-              <w:rPr/>
-              <w:t xml:space="preserve">Kanwil Kementerian Agama Provinsi Riau</w:t>
+              <w:t xml:space="preserve">Lektor</w:t>
+            </w:r>
+          </w:p>
+        </w:tc>
+        <w:tc>
+          <w:tcPr>
+            <w:tcW w:w="3000" w:type="dxa"/>
+            <w:noWrap/>
+          </w:tcPr>
+          <w:p>
+            <w:pPr>
+              <w:jc w:val="left"/>
+            </w:pPr>
+            <w:r>
+              <w:rPr/>
+              <w:t xml:space="preserve">Universitas Islam Negeri Sultan Syarif Kasim Riau</w:t>
             </w:r>
           </w:p>
         </w:tc>
@@ -4001,7 +4001,7 @@
             </w:pPr>
             <w:r>
               <w:rPr/>
-              <w:t xml:space="preserve">Muhammad Amirul Adli, S.Sos.</w:t>
+              <w:t xml:space="preserve">‌Dr. MASRIZAL, SE., M.SEI</w:t>
             </w:r>
           </w:p>
         </w:tc>
@@ -4016,7 +4016,7 @@
             </w:pPr>
             <w:r>
               <w:rPr/>
-              <w:t xml:space="preserve">200111082025051008.0</w:t>
+              <w:t xml:space="preserve">199506132025051002</w:t>
             </w:r>
           </w:p>
         </w:tc>
@@ -4031,7 +4031,7 @@
             </w:pPr>
             <w:r>
               <w:rPr/>
-              <w:t xml:space="preserve">III/a</w:t>
+              <w:t xml:space="preserve">III/c</w:t>
             </w:r>
           </w:p>
         </w:tc>
@@ -4046,22 +4046,22 @@
             </w:pPr>
             <w:r>
               <w:rPr/>
-              <w:t xml:space="preserve">Penghulu Ahli Pertama</w:t>
-            </w:r>
-          </w:p>
-        </w:tc>
-        <w:tc>
-          <w:tcPr>
-            <w:tcW w:w="3000" w:type="dxa"/>
-            <w:noWrap/>
-          </w:tcPr>
-          <w:p>
-            <w:pPr>
-              <w:jc w:val="left"/>
-            </w:pPr>
-            <w:r>
-              <w:rPr/>
-              <w:t xml:space="preserve">Kanwil Kementerian Agama Provinsi Riau</w:t>
+              <w:t xml:space="preserve">Lektor</w:t>
+            </w:r>
+          </w:p>
+        </w:tc>
+        <w:tc>
+          <w:tcPr>
+            <w:tcW w:w="3000" w:type="dxa"/>
+            <w:noWrap/>
+          </w:tcPr>
+          <w:p>
+            <w:pPr>
+              <w:jc w:val="left"/>
+            </w:pPr>
+            <w:r>
+              <w:rPr/>
+              <w:t xml:space="preserve">Universitas Islam Negeri Sultan Syarif Kasim Riau</w:t>
             </w:r>
           </w:p>
         </w:tc>
@@ -4094,7 +4094,7 @@
             </w:pPr>
             <w:r>
               <w:rPr/>
-              <w:t xml:space="preserve">Muhammad Haqqul Amri, S.Ag.</w:t>
+              <w:t xml:space="preserve">‌Dr. MUHAMMAD ADNAN AZZAKI, S.E., M.E</w:t>
             </w:r>
           </w:p>
         </w:tc>
@@ -4109,7 +4109,7 @@
             </w:pPr>
             <w:r>
               <w:rPr/>
-              <w:t xml:space="preserve">199906112025051008.0</w:t>
+              <w:t xml:space="preserve">199609272025051003</w:t>
             </w:r>
           </w:p>
         </w:tc>
@@ -4124,7 +4124,7 @@
             </w:pPr>
             <w:r>
               <w:rPr/>
-              <w:t xml:space="preserve">III/a</w:t>
+              <w:t xml:space="preserve">III/c</w:t>
             </w:r>
           </w:p>
         </w:tc>
@@ -4139,22 +4139,22 @@
             </w:pPr>
             <w:r>
               <w:rPr/>
-              <w:t xml:space="preserve">Penghulu Ahli Pertama</w:t>
-            </w:r>
-          </w:p>
-        </w:tc>
-        <w:tc>
-          <w:tcPr>
-            <w:tcW w:w="3000" w:type="dxa"/>
-            <w:noWrap/>
-          </w:tcPr>
-          <w:p>
-            <w:pPr>
-              <w:jc w:val="left"/>
-            </w:pPr>
-            <w:r>
-              <w:rPr/>
-              <w:t xml:space="preserve">Kanwil Kementerian Agama Provinsi Riau</w:t>
+              <w:t xml:space="preserve">Lektor</w:t>
+            </w:r>
+          </w:p>
+        </w:tc>
+        <w:tc>
+          <w:tcPr>
+            <w:tcW w:w="3000" w:type="dxa"/>
+            <w:noWrap/>
+          </w:tcPr>
+          <w:p>
+            <w:pPr>
+              <w:jc w:val="left"/>
+            </w:pPr>
+            <w:r>
+              <w:rPr/>
+              <w:t xml:space="preserve">Universitas Islam Negeri Sultan Syarif Kasim Riau</w:t>
             </w:r>
           </w:p>
         </w:tc>
@@ -4187,7 +4187,7 @@
             </w:pPr>
             <w:r>
               <w:rPr/>
-              <w:t xml:space="preserve">Muhammad Sulfi, S.Sy.</w:t>
+              <w:t xml:space="preserve">‌Dr. NYAK MUSTAKIM, M.Pd.I</w:t>
             </w:r>
           </w:p>
         </w:tc>
@@ -4202,7 +4202,7 @@
             </w:pPr>
             <w:r>
               <w:rPr/>
-              <w:t xml:space="preserve">199409142025051008.0</w:t>
+              <w:t xml:space="preserve">198607272025051001</w:t>
             </w:r>
           </w:p>
         </w:tc>
@@ -4217,7 +4217,7 @@
             </w:pPr>
             <w:r>
               <w:rPr/>
-              <w:t xml:space="preserve">III/a</w:t>
+              <w:t xml:space="preserve">III/c</w:t>
             </w:r>
           </w:p>
         </w:tc>
@@ -4232,22 +4232,22 @@
             </w:pPr>
             <w:r>
               <w:rPr/>
-              <w:t xml:space="preserve">Penghulu Ahli Pertama</w:t>
-            </w:r>
-          </w:p>
-        </w:tc>
-        <w:tc>
-          <w:tcPr>
-            <w:tcW w:w="3000" w:type="dxa"/>
-            <w:noWrap/>
-          </w:tcPr>
-          <w:p>
-            <w:pPr>
-              <w:jc w:val="left"/>
-            </w:pPr>
-            <w:r>
-              <w:rPr/>
-              <w:t xml:space="preserve">Kanwil Kementerian Agama Provinsi Riau</w:t>
+              <w:t xml:space="preserve">Lektor</w:t>
+            </w:r>
+          </w:p>
+        </w:tc>
+        <w:tc>
+          <w:tcPr>
+            <w:tcW w:w="3000" w:type="dxa"/>
+            <w:noWrap/>
+          </w:tcPr>
+          <w:p>
+            <w:pPr>
+              <w:jc w:val="left"/>
+            </w:pPr>
+            <w:r>
+              <w:rPr/>
+              <w:t xml:space="preserve">Universitas Islam Negeri Sultan Syarif Kasim Riau</w:t>
             </w:r>
           </w:p>
         </w:tc>
@@ -4280,7 +4280,7 @@
             </w:pPr>
             <w:r>
               <w:rPr/>
-              <w:t xml:space="preserve">Ofri Waldi, S.H.</w:t>
+              <w:t xml:space="preserve">‌Dr. RAJA SAKTI PUTRA HARAHAP, S.Pd., M.E.I</w:t>
             </w:r>
           </w:p>
         </w:tc>
@@ -4295,7 +4295,7 @@
             </w:pPr>
             <w:r>
               <w:rPr/>
-              <w:t xml:space="preserve">199810042025051008.0</w:t>
+              <w:t xml:space="preserve">198802142025051001</w:t>
             </w:r>
           </w:p>
         </w:tc>
@@ -4310,7 +4310,7 @@
             </w:pPr>
             <w:r>
               <w:rPr/>
-              <w:t xml:space="preserve">III/a</w:t>
+              <w:t xml:space="preserve">III/c</w:t>
             </w:r>
           </w:p>
         </w:tc>
@@ -4325,22 +4325,22 @@
             </w:pPr>
             <w:r>
               <w:rPr/>
-              <w:t xml:space="preserve">Analis Hukum Ahli Pertama</w:t>
-            </w:r>
-          </w:p>
-        </w:tc>
-        <w:tc>
-          <w:tcPr>
-            <w:tcW w:w="3000" w:type="dxa"/>
-            <w:noWrap/>
-          </w:tcPr>
-          <w:p>
-            <w:pPr>
-              <w:jc w:val="left"/>
-            </w:pPr>
-            <w:r>
-              <w:rPr/>
-              <w:t xml:space="preserve">Kanwil Kementerian Agama Provinsi Riau</w:t>
+              <w:t xml:space="preserve">Lektor</w:t>
+            </w:r>
+          </w:p>
+        </w:tc>
+        <w:tc>
+          <w:tcPr>
+            <w:tcW w:w="3000" w:type="dxa"/>
+            <w:noWrap/>
+          </w:tcPr>
+          <w:p>
+            <w:pPr>
+              <w:jc w:val="left"/>
+            </w:pPr>
+            <w:r>
+              <w:rPr/>
+              <w:t xml:space="preserve">Universitas Islam Negeri Sultan Syarif Kasim Riau</w:t>
             </w:r>
           </w:p>
         </w:tc>
@@ -4373,7 +4373,7 @@
             </w:pPr>
             <w:r>
               <w:rPr/>
-              <w:t xml:space="preserve">Rani Yuniati, S.Si.</w:t>
+              <w:t xml:space="preserve">‌MUHAMMAD ALAN JUHRI, M.A</w:t>
             </w:r>
           </w:p>
         </w:tc>
@@ -4388,7 +4388,7 @@
             </w:pPr>
             <w:r>
               <w:rPr/>
-              <w:t xml:space="preserve">199205312025052000.0</w:t>
+              <w:t xml:space="preserve">199801252025051002</w:t>
             </w:r>
           </w:p>
         </w:tc>
@@ -4403,7 +4403,7 @@
             </w:pPr>
             <w:r>
               <w:rPr/>
-              <w:t xml:space="preserve">III/a</w:t>
+              <w:t xml:space="preserve">III/b</w:t>
             </w:r>
           </w:p>
         </w:tc>
@@ -4418,22 +4418,22 @@
             </w:pPr>
             <w:r>
               <w:rPr/>
-              <w:t xml:space="preserve">Pengawas Jaminan Produk Halal Ahli Pertama</w:t>
-            </w:r>
-          </w:p>
-        </w:tc>
-        <w:tc>
-          <w:tcPr>
-            <w:tcW w:w="3000" w:type="dxa"/>
-            <w:noWrap/>
-          </w:tcPr>
-          <w:p>
-            <w:pPr>
-              <w:jc w:val="left"/>
-            </w:pPr>
-            <w:r>
-              <w:rPr/>
-              <w:t xml:space="preserve">Kanwil Kementerian Agama Provinsi Riau</w:t>
+              <w:t xml:space="preserve">Asisten Ahli</w:t>
+            </w:r>
+          </w:p>
+        </w:tc>
+        <w:tc>
+          <w:tcPr>
+            <w:tcW w:w="3000" w:type="dxa"/>
+            <w:noWrap/>
+          </w:tcPr>
+          <w:p>
+            <w:pPr>
+              <w:jc w:val="left"/>
+            </w:pPr>
+            <w:r>
+              <w:rPr/>
+              <w:t xml:space="preserve">Universitas Islam Negeri Sultan Syarif Kasim Riau</w:t>
             </w:r>
           </w:p>
         </w:tc>
@@ -4466,7 +4466,7 @@
             </w:pPr>
             <w:r>
               <w:rPr/>
-              <w:t xml:space="preserve">Rendi Pratama, S.Pd.</w:t>
+              <w:t xml:space="preserve">‌NABHILLA VIONISYAFIRA, S.E.</w:t>
             </w:r>
           </w:p>
         </w:tc>
@@ -4481,7 +4481,7 @@
             </w:pPr>
             <w:r>
               <w:rPr/>
-              <w:t xml:space="preserve">199308052025051008.0</w:t>
+              <w:t xml:space="preserve">199811192025052005</w:t>
             </w:r>
           </w:p>
         </w:tc>
@@ -4496,7 +4496,7 @@
             </w:pPr>
             <w:r>
               <w:rPr/>
-              <w:t xml:space="preserve">III/a</w:t>
+              <w:t xml:space="preserve">III/A</w:t>
             </w:r>
           </w:p>
         </w:tc>
@@ -4511,22 +4511,22 @@
             </w:pPr>
             <w:r>
               <w:rPr/>
-              <w:t xml:space="preserve">Guru Ahli Pertama  -  Guru Penjasorkes</w:t>
-            </w:r>
-          </w:p>
-        </w:tc>
-        <w:tc>
-          <w:tcPr>
-            <w:tcW w:w="3000" w:type="dxa"/>
-            <w:noWrap/>
-          </w:tcPr>
-          <w:p>
-            <w:pPr>
-              <w:jc w:val="left"/>
-            </w:pPr>
-            <w:r>
-              <w:rPr/>
-              <w:t xml:space="preserve">Kanwil Kementerian Agama Provinsi Riau</w:t>
+              <w:t xml:space="preserve">Auditor Ahli Pertama</w:t>
+            </w:r>
+          </w:p>
+        </w:tc>
+        <w:tc>
+          <w:tcPr>
+            <w:tcW w:w="3000" w:type="dxa"/>
+            <w:noWrap/>
+          </w:tcPr>
+          <w:p>
+            <w:pPr>
+              <w:jc w:val="left"/>
+            </w:pPr>
+            <w:r>
+              <w:rPr/>
+              <w:t xml:space="preserve">Universitas Islam Negeri Sultan Syarif Kasim Riau</w:t>
             </w:r>
           </w:p>
         </w:tc>
@@ -4559,7 +4559,7 @@
             </w:pPr>
             <w:r>
               <w:rPr/>
-              <w:t xml:space="preserve">Sahara Tulaini, S.T.</w:t>
+              <w:t xml:space="preserve">‌NASRUL FATAH, M.Ag</w:t>
             </w:r>
           </w:p>
         </w:tc>
@@ -4574,7 +4574,7 @@
             </w:pPr>
             <w:r>
               <w:rPr/>
-              <w:t xml:space="preserve">199411222025052000.0</w:t>
+              <w:t xml:space="preserve">199112242025051002</w:t>
             </w:r>
           </w:p>
         </w:tc>
@@ -4589,7 +4589,7 @@
             </w:pPr>
             <w:r>
               <w:rPr/>
-              <w:t xml:space="preserve">III/a</w:t>
+              <w:t xml:space="preserve">III/b</w:t>
             </w:r>
           </w:p>
         </w:tc>
@@ -4604,22 +4604,22 @@
             </w:pPr>
             <w:r>
               <w:rPr/>
-              <w:t xml:space="preserve">Guru Ahli Pertama</w:t>
-            </w:r>
-          </w:p>
-        </w:tc>
-        <w:tc>
-          <w:tcPr>
-            <w:tcW w:w="3000" w:type="dxa"/>
-            <w:noWrap/>
-          </w:tcPr>
-          <w:p>
-            <w:pPr>
-              <w:jc w:val="left"/>
-            </w:pPr>
-            <w:r>
-              <w:rPr/>
-              <w:t xml:space="preserve">Kanwil Kementerian Agama Provinsi Riau</w:t>
+              <w:t xml:space="preserve">Asisten Ahli</w:t>
+            </w:r>
+          </w:p>
+        </w:tc>
+        <w:tc>
+          <w:tcPr>
+            <w:tcW w:w="3000" w:type="dxa"/>
+            <w:noWrap/>
+          </w:tcPr>
+          <w:p>
+            <w:pPr>
+              <w:jc w:val="left"/>
+            </w:pPr>
+            <w:r>
+              <w:rPr/>
+              <w:t xml:space="preserve">Universitas Islam Negeri Sultan Syarif Kasim Riau</w:t>
             </w:r>
           </w:p>
         </w:tc>
@@ -4652,7 +4652,7 @@
             </w:pPr>
             <w:r>
               <w:rPr/>
-              <w:t xml:space="preserve">Syahrul Syahroby, S.H.</w:t>
+              <w:t xml:space="preserve">‌RASMON, S.E., M.Ak</w:t>
             </w:r>
           </w:p>
         </w:tc>
@@ -4667,7 +4667,7 @@
             </w:pPr>
             <w:r>
               <w:rPr/>
-              <w:t xml:space="preserve">200208092025051008.0</w:t>
+              <w:t xml:space="preserve">199208312025051003</w:t>
             </w:r>
           </w:p>
         </w:tc>
@@ -4682,7 +4682,7 @@
             </w:pPr>
             <w:r>
               <w:rPr/>
-              <w:t xml:space="preserve">III/a</w:t>
+              <w:t xml:space="preserve">III/b</w:t>
             </w:r>
           </w:p>
         </w:tc>
@@ -4697,22 +4697,22 @@
             </w:pPr>
             <w:r>
               <w:rPr/>
-              <w:t xml:space="preserve">Penghulu Ahli Pertama</w:t>
-            </w:r>
-          </w:p>
-        </w:tc>
-        <w:tc>
-          <w:tcPr>
-            <w:tcW w:w="3000" w:type="dxa"/>
-            <w:noWrap/>
-          </w:tcPr>
-          <w:p>
-            <w:pPr>
-              <w:jc w:val="left"/>
-            </w:pPr>
-            <w:r>
-              <w:rPr/>
-              <w:t xml:space="preserve">Kanwil Kementerian Agama Provinsi Riau</w:t>
+              <w:t xml:space="preserve">Asisten Ahli</w:t>
+            </w:r>
+          </w:p>
+        </w:tc>
+        <w:tc>
+          <w:tcPr>
+            <w:tcW w:w="3000" w:type="dxa"/>
+            <w:noWrap/>
+          </w:tcPr>
+          <w:p>
+            <w:pPr>
+              <w:jc w:val="left"/>
+            </w:pPr>
+            <w:r>
+              <w:rPr/>
+              <w:t xml:space="preserve">Universitas Islam Negeri Sultan Syarif Kasim Riau</w:t>
             </w:r>
           </w:p>
         </w:tc>
@@ -4745,7 +4745,7 @@
             </w:pPr>
             <w:r>
               <w:rPr/>
-              <w:t xml:space="preserve">Syarifah Annafisah, S.Pd.</w:t>
+              <w:t xml:space="preserve">‌ROLLI GAUTAMA, M.Pd</w:t>
             </w:r>
           </w:p>
         </w:tc>
@@ -4760,7 +4760,7 @@
             </w:pPr>
             <w:r>
               <w:rPr/>
-              <w:t xml:space="preserve">199901202025052000.0</w:t>
+              <w:t xml:space="preserve">199311112025051002</w:t>
             </w:r>
           </w:p>
         </w:tc>
@@ -4775,7 +4775,7 @@
             </w:pPr>
             <w:r>
               <w:rPr/>
-              <w:t xml:space="preserve">III/a</w:t>
+              <w:t xml:space="preserve">III/b</w:t>
             </w:r>
           </w:p>
         </w:tc>
@@ -4790,22 +4790,22 @@
             </w:pPr>
             <w:r>
               <w:rPr/>
-              <w:t xml:space="preserve">Guru Ahli Pertama  -  Guru TIK</w:t>
-            </w:r>
-          </w:p>
-        </w:tc>
-        <w:tc>
-          <w:tcPr>
-            <w:tcW w:w="3000" w:type="dxa"/>
-            <w:noWrap/>
-          </w:tcPr>
-          <w:p>
-            <w:pPr>
-              <w:jc w:val="left"/>
-            </w:pPr>
-            <w:r>
-              <w:rPr/>
-              <w:t xml:space="preserve">Kanwil Kementerian Agama Provinsi Riau</w:t>
+              <w:t xml:space="preserve">Asisten Ahli</w:t>
+            </w:r>
+          </w:p>
+        </w:tc>
+        <w:tc>
+          <w:tcPr>
+            <w:tcW w:w="3000" w:type="dxa"/>
+            <w:noWrap/>
+          </w:tcPr>
+          <w:p>
+            <w:pPr>
+              <w:jc w:val="left"/>
+            </w:pPr>
+            <w:r>
+              <w:rPr/>
+              <w:t xml:space="preserve">Universitas Islam Negeri Sultan Syarif Kasim Riau</w:t>
             </w:r>
           </w:p>
         </w:tc>
@@ -4838,7 +4838,7 @@
             </w:pPr>
             <w:r>
               <w:rPr/>
-              <w:t xml:space="preserve">Yulia Viviyanti, S.Pd.</w:t>
+              <w:t xml:space="preserve">‌SUHERI, S.Ag., M.A</w:t>
             </w:r>
           </w:p>
         </w:tc>
@@ -4853,7 +4853,7 @@
             </w:pPr>
             <w:r>
               <w:rPr/>
-              <w:t xml:space="preserve">199507102025052000.0</w:t>
+              <w:t xml:space="preserve">199509192025051002</w:t>
             </w:r>
           </w:p>
         </w:tc>
@@ -4868,7 +4868,7 @@
             </w:pPr>
             <w:r>
               <w:rPr/>
-              <w:t xml:space="preserve">III/a</w:t>
+              <w:t xml:space="preserve">III/b</w:t>
             </w:r>
           </w:p>
         </w:tc>
@@ -4883,22 +4883,22 @@
             </w:pPr>
             <w:r>
               <w:rPr/>
-              <w:t xml:space="preserve">Guru Ahli Pertama  -  Guru PPKn</w:t>
-            </w:r>
-          </w:p>
-        </w:tc>
-        <w:tc>
-          <w:tcPr>
-            <w:tcW w:w="3000" w:type="dxa"/>
-            <w:noWrap/>
-          </w:tcPr>
-          <w:p>
-            <w:pPr>
-              <w:jc w:val="left"/>
-            </w:pPr>
-            <w:r>
-              <w:rPr/>
-              <w:t xml:space="preserve">Kanwil Kementerian Agama Provinsi Riau</w:t>
+              <w:t xml:space="preserve">Asisten Ahli</w:t>
+            </w:r>
+          </w:p>
+        </w:tc>
+        <w:tc>
+          <w:tcPr>
+            <w:tcW w:w="3000" w:type="dxa"/>
+            <w:noWrap/>
+          </w:tcPr>
+          <w:p>
+            <w:pPr>
+              <w:jc w:val="left"/>
+            </w:pPr>
+            <w:r>
+              <w:rPr/>
+              <w:t xml:space="preserve">Universitas Islam Negeri Sultan Syarif Kasim Riau</w:t>
             </w:r>
           </w:p>
         </w:tc>
@@ -4931,7 +4931,7 @@
             </w:pPr>
             <w:r>
               <w:rPr/>
-              <w:t xml:space="preserve">Zamakhsari, S.Si.</w:t>
+              <w:t xml:space="preserve">‌TARMIZI, M.A.</w:t>
             </w:r>
           </w:p>
         </w:tc>
@@ -4946,7 +4946,7 @@
             </w:pPr>
             <w:r>
               <w:rPr/>
-              <w:t xml:space="preserve">199607142025051008.0</w:t>
+              <w:t xml:space="preserve">199703172025051001</w:t>
             </w:r>
           </w:p>
         </w:tc>
@@ -4961,7 +4961,7 @@
             </w:pPr>
             <w:r>
               <w:rPr/>
-              <w:t xml:space="preserve">III/a</w:t>
+              <w:t xml:space="preserve">III/b</w:t>
             </w:r>
           </w:p>
         </w:tc>
@@ -4976,22 +4976,22 @@
             </w:pPr>
             <w:r>
               <w:rPr/>
-              <w:t xml:space="preserve">Pengelola Pengadaan Barang  /  Jasa Ahli Pertama</w:t>
-            </w:r>
-          </w:p>
-        </w:tc>
-        <w:tc>
-          <w:tcPr>
-            <w:tcW w:w="3000" w:type="dxa"/>
-            <w:noWrap/>
-          </w:tcPr>
-          <w:p>
-            <w:pPr>
-              <w:jc w:val="left"/>
-            </w:pPr>
-            <w:r>
-              <w:rPr/>
-              <w:t xml:space="preserve">Kanwil Kementerian Agama Provinsi Riau</w:t>
+              <w:t xml:space="preserve">Asisten Ahli</w:t>
+            </w:r>
+          </w:p>
+        </w:tc>
+        <w:tc>
+          <w:tcPr>
+            <w:tcW w:w="3000" w:type="dxa"/>
+            <w:noWrap/>
+          </w:tcPr>
+          <w:p>
+            <w:pPr>
+              <w:jc w:val="left"/>
+            </w:pPr>
+            <w:r>
+              <w:rPr/>
+              <w:t xml:space="preserve">Universitas Islam Negeri Sultan Syarif Kasim Riau</w:t>
             </w:r>
           </w:p>
         </w:tc>
@@ -5024,7 +5024,7 @@
             </w:pPr>
             <w:r>
               <w:rPr/>
-              <w:t xml:space="preserve">Zulhiza, S.H.</w:t>
+              <w:t xml:space="preserve">‌WAWAN HERWANSYAH, S.T.</w:t>
             </w:r>
           </w:p>
         </w:tc>
@@ -5039,7 +5039,7 @@
             </w:pPr>
             <w:r>
               <w:rPr/>
-              <w:t xml:space="preserve">199405072025051008.0</w:t>
+              <w:t xml:space="preserve">200104152025051004</w:t>
             </w:r>
           </w:p>
         </w:tc>
@@ -5054,7 +5054,7 @@
             </w:pPr>
             <w:r>
               <w:rPr/>
-              <w:t xml:space="preserve">III/a</w:t>
+              <w:t xml:space="preserve">III/A</w:t>
             </w:r>
           </w:p>
         </w:tc>
@@ -5069,22 +5069,22 @@
             </w:pPr>
             <w:r>
               <w:rPr/>
-              <w:t xml:space="preserve">Penghulu Ahli Pertama</w:t>
-            </w:r>
-          </w:p>
-        </w:tc>
-        <w:tc>
-          <w:tcPr>
-            <w:tcW w:w="3000" w:type="dxa"/>
-            <w:noWrap/>
-          </w:tcPr>
-          <w:p>
-            <w:pPr>
-              <w:jc w:val="left"/>
-            </w:pPr>
-            <w:r>
-              <w:rPr/>
-              <w:t xml:space="preserve">Kanwil Kementerian Agama Provinsi Riau</w:t>
+              <w:t xml:space="preserve">Pranata Komputer Ahli Pertama</w:t>
+            </w:r>
+          </w:p>
+        </w:tc>
+        <w:tc>
+          <w:tcPr>
+            <w:tcW w:w="3000" w:type="dxa"/>
+            <w:noWrap/>
+          </w:tcPr>
+          <w:p>
+            <w:pPr>
+              <w:jc w:val="left"/>
+            </w:pPr>
+            <w:r>
+              <w:rPr/>
+              <w:t xml:space="preserve">Universitas Islam Negeri Sultan Syarif Kasim Riau</w:t>
             </w:r>
           </w:p>
         </w:tc>
@@ -5112,7 +5112,7 @@
           <w:sz w:val="24"/>
           <w:szCs w:val="24"/>
         </w:rPr>
-        <w:t xml:space="preserve">Tenaga pengajar Pelatihan Dasar CPNS Golongan III Angkatan I tahun 2025 merupakan tenaga-tenaga ahli yang berkompeten di bidangnya sesuai dengan mata pelatihan yang diajarkan dalam Pelatihan Dasar CPNS. Rincian tenaga pengajar sebagai berikut:</w:t>
+        <w:t xml:space="preserve">Tenaga pengajar Pelatihan Dasar CPNS Golongan III Angkatan 1 Tahun 2025 tahun 2025 merupakan tenaga-tenaga ahli yang berkompeten di bidangnya sesuai dengan mata pelatihan yang diajarkan. Rincian tenaga pengajar sebagai berikut:</w:t>
       </w:r>
     </w:p>
     <w:tbl>
@@ -5275,7 +5275,7 @@
             <w:pPr/>
             <w:r>
               <w:rPr/>
-              <w:t xml:space="preserve">Agenda 1</w:t>
+              <w:t xml:space="preserve">Kebijakan Pengembangan Sumber Daya Manusia Aparatur dan Nilai Dasar ASN</w:t>
             </w:r>
           </w:p>
         </w:tc>
@@ -5305,7 +5305,7 @@
             </w:pPr>
             <w:r>
               <w:rPr/>
-              <w:t xml:space="preserve">0</w:t>
+              <w:t xml:space="preserve">2</w:t>
             </w:r>
           </w:p>
         </w:tc>
@@ -5320,7 +5320,7 @@
             </w:pPr>
             <w:r>
               <w:rPr/>
-              <w:t xml:space="preserve">1</w:t>
+              <w:t xml:space="preserve"/>
             </w:r>
           </w:p>
         </w:tc>
@@ -5333,7 +5333,7 @@
             <w:pPr/>
             <w:r>
               <w:rPr/>
-              <w:t xml:space="preserve">H. Aprianto S.Ag., M.A..</w:t>
+              <w:t xml:space="preserve">Prof. Dr. H. Muhammad Ali Ramdhani, S.TP., M.T</w:t>
             </w:r>
           </w:p>
         </w:tc>
@@ -5364,7 +5364,7 @@
             <w:pPr/>
             <w:r>
               <w:rPr/>
-              <w:t xml:space="preserve">Agenda 1</w:t>
+              <w:t xml:space="preserve">Overview  Kebijakan Penyelenggaraan Latsar CPNS</w:t>
             </w:r>
           </w:p>
         </w:tc>
@@ -5394,7 +5394,7 @@
             </w:pPr>
             <w:r>
               <w:rPr/>
-              <w:t xml:space="preserve">0</w:t>
+              <w:t xml:space="preserve">1</w:t>
             </w:r>
           </w:p>
         </w:tc>
@@ -5409,7 +5409,7 @@
             </w:pPr>
             <w:r>
               <w:rPr/>
-              <w:t xml:space="preserve">2</w:t>
+              <w:t xml:space="preserve"/>
             </w:r>
           </w:p>
         </w:tc>
@@ -5422,7 +5422,7 @@
             <w:pPr/>
             <w:r>
               <w:rPr/>
-              <w:t xml:space="preserve">Dr. Mardiyanti, M.Pd</w:t>
+              <w:t xml:space="preserve">Suryandi, S.IP</w:t>
             </w:r>
           </w:p>
         </w:tc>
@@ -5453,7 +5453,7 @@
             <w:pPr/>
             <w:r>
               <w:rPr/>
-              <w:t xml:space="preserve">Agenda 2</w:t>
+              <w:t xml:space="preserve">Muatan Teknis Substantif Lembaga (MTSL)</w:t>
             </w:r>
           </w:p>
         </w:tc>
@@ -5511,7 +5511,695 @@
             <w:pPr/>
             <w:r>
               <w:rPr/>
+              <w:t xml:space="preserve">Dr. H. Muliardi, M.Pd.</w:t>
+            </w:r>
+          </w:p>
+        </w:tc>
+      </w:tr>
+      <w:tr>
+        <w:trPr/>
+        <w:tc>
+          <w:tcPr>
+            <w:tcW w:w="900" w:type="dxa"/>
+            <w:noWrap/>
+          </w:tcPr>
+          <w:p>
+            <w:pPr>
+              <w:jc w:val="center"/>
+            </w:pPr>
+            <w:r>
+              <w:rPr/>
+              <w:t xml:space="preserve">4</w:t>
+            </w:r>
+          </w:p>
+        </w:tc>
+        <w:tc>
+          <w:tcPr>
+            <w:tcW w:w="5400" w:type="dxa"/>
+            <w:noWrap/>
+          </w:tcPr>
+          <w:p>
+            <w:pPr/>
+            <w:r>
+              <w:rPr/>
+              <w:t xml:space="preserve">Dinamika Kelompok</w:t>
+            </w:r>
+          </w:p>
+        </w:tc>
+        <w:tc>
+          <w:tcPr>
+            <w:tcW w:w="1200" w:type="dxa"/>
+            <w:noWrap/>
+          </w:tcPr>
+          <w:p>
+            <w:pPr>
+              <w:jc w:val="center"/>
+            </w:pPr>
+            <w:r>
+              <w:rPr/>
+              <w:t xml:space="preserve">0</w:t>
+            </w:r>
+          </w:p>
+        </w:tc>
+        <w:tc>
+          <w:tcPr>
+            <w:tcW w:w="1200" w:type="dxa"/>
+            <w:noWrap/>
+          </w:tcPr>
+          <w:p>
+            <w:pPr>
+              <w:jc w:val="center"/>
+            </w:pPr>
+            <w:r>
+              <w:rPr/>
+              <w:t xml:space="preserve">3</w:t>
+            </w:r>
+          </w:p>
+        </w:tc>
+        <w:tc>
+          <w:tcPr>
+            <w:tcW w:w="900" w:type="dxa"/>
+            <w:noWrap/>
+          </w:tcPr>
+          <w:p>
+            <w:pPr>
+              <w:jc w:val="center"/>
+            </w:pPr>
+            <w:r>
+              <w:rPr/>
               <w:t xml:space="preserve"/>
+            </w:r>
+          </w:p>
+        </w:tc>
+        <w:tc>
+          <w:tcPr>
+            <w:tcW w:w="2600" w:type="dxa"/>
+            <w:noWrap/>
+          </w:tcPr>
+          <w:p>
+            <w:pPr/>
+            <w:r>
+              <w:rPr/>
+              <w:t xml:space="preserve">Nur Aisyah, S.Sos</w:t>
+            </w:r>
+          </w:p>
+        </w:tc>
+      </w:tr>
+      <w:tr>
+        <w:trPr/>
+        <w:tc>
+          <w:tcPr>
+            <w:tcW w:w="900" w:type="dxa"/>
+            <w:noWrap/>
+          </w:tcPr>
+          <w:p>
+            <w:pPr>
+              <w:jc w:val="center"/>
+            </w:pPr>
+            <w:r>
+              <w:rPr/>
+              <w:t xml:space="preserve">5</w:t>
+            </w:r>
+          </w:p>
+        </w:tc>
+        <w:tc>
+          <w:tcPr>
+            <w:tcW w:w="5400" w:type="dxa"/>
+            <w:noWrap/>
+          </w:tcPr>
+          <w:p>
+            <w:pPr/>
+            <w:r>
+              <w:rPr/>
+              <w:t xml:space="preserve">Agenda 1: Sikap Perilaku Bela Negara</w:t>
+            </w:r>
+          </w:p>
+        </w:tc>
+        <w:tc>
+          <w:tcPr>
+            <w:tcW w:w="1200" w:type="dxa"/>
+            <w:noWrap/>
+          </w:tcPr>
+          <w:p>
+            <w:pPr>
+              <w:jc w:val="center"/>
+            </w:pPr>
+            <w:r>
+              <w:rPr/>
+              <w:t xml:space="preserve">20</w:t>
+            </w:r>
+          </w:p>
+        </w:tc>
+        <w:tc>
+          <w:tcPr>
+            <w:tcW w:w="1200" w:type="dxa"/>
+            <w:noWrap/>
+          </w:tcPr>
+          <w:p>
+            <w:pPr>
+              <w:jc w:val="center"/>
+            </w:pPr>
+            <w:r>
+              <w:rPr/>
+              <w:t xml:space="preserve">5</w:t>
+            </w:r>
+          </w:p>
+        </w:tc>
+        <w:tc>
+          <w:tcPr>
+            <w:tcW w:w="900" w:type="dxa"/>
+            <w:noWrap/>
+          </w:tcPr>
+          <w:p>
+            <w:pPr>
+              <w:jc w:val="center"/>
+            </w:pPr>
+            <w:r>
+              <w:rPr/>
+              <w:t xml:space="preserve">1</w:t>
+            </w:r>
+          </w:p>
+        </w:tc>
+        <w:tc>
+          <w:tcPr>
+            <w:tcW w:w="2600" w:type="dxa"/>
+            <w:noWrap/>
+          </w:tcPr>
+          <w:p>
+            <w:pPr/>
+            <w:r>
+              <w:rPr/>
+              <w:t xml:space="preserve">H. Aprianto S.Ag., M.A..</w:t>
+            </w:r>
+          </w:p>
+        </w:tc>
+      </w:tr>
+      <w:tr>
+        <w:trPr/>
+        <w:tc>
+          <w:tcPr>
+            <w:tcW w:w="900" w:type="dxa"/>
+            <w:noWrap/>
+          </w:tcPr>
+          <w:p>
+            <w:pPr/>
+            <w:r>
+              <w:rPr/>
+              <w:t xml:space="preserve"/>
+            </w:r>
+          </w:p>
+        </w:tc>
+        <w:tc>
+          <w:tcPr>
+            <w:tcW w:w="5400" w:type="dxa"/>
+            <w:noWrap/>
+          </w:tcPr>
+          <w:p>
+            <w:pPr/>
+            <w:r>
+              <w:rPr/>
+              <w:t xml:space="preserve"/>
+            </w:r>
+          </w:p>
+        </w:tc>
+        <w:tc>
+          <w:tcPr>
+            <w:tcW w:w="1200" w:type="dxa"/>
+            <w:noWrap/>
+          </w:tcPr>
+          <w:p>
+            <w:pPr/>
+            <w:r>
+              <w:rPr/>
+              <w:t xml:space="preserve"/>
+            </w:r>
+          </w:p>
+        </w:tc>
+        <w:tc>
+          <w:tcPr>
+            <w:tcW w:w="1200" w:type="dxa"/>
+            <w:noWrap/>
+          </w:tcPr>
+          <w:p>
+            <w:pPr/>
+            <w:r>
+              <w:rPr/>
+              <w:t xml:space="preserve"/>
+            </w:r>
+          </w:p>
+        </w:tc>
+        <w:tc>
+          <w:tcPr>
+            <w:tcW w:w="900" w:type="dxa"/>
+            <w:noWrap/>
+          </w:tcPr>
+          <w:p>
+            <w:pPr>
+              <w:jc w:val="center"/>
+            </w:pPr>
+            <w:r>
+              <w:rPr/>
+              <w:t xml:space="preserve">2</w:t>
+            </w:r>
+          </w:p>
+        </w:tc>
+        <w:tc>
+          <w:tcPr>
+            <w:tcW w:w="2600" w:type="dxa"/>
+            <w:noWrap/>
+          </w:tcPr>
+          <w:p>
+            <w:pPr/>
+            <w:r>
+              <w:rPr/>
+              <w:t xml:space="preserve">Dr. Hj. Mardiyanti. MPd</w:t>
+            </w:r>
+          </w:p>
+        </w:tc>
+      </w:tr>
+      <w:tr>
+        <w:trPr/>
+        <w:tc>
+          <w:tcPr>
+            <w:tcW w:w="900" w:type="dxa"/>
+            <w:noWrap/>
+          </w:tcPr>
+          <w:p>
+            <w:pPr/>
+            <w:r>
+              <w:rPr/>
+              <w:t xml:space="preserve"/>
+            </w:r>
+          </w:p>
+        </w:tc>
+        <w:tc>
+          <w:tcPr>
+            <w:tcW w:w="5400" w:type="dxa"/>
+            <w:noWrap/>
+          </w:tcPr>
+          <w:p>
+            <w:pPr/>
+            <w:r>
+              <w:rPr/>
+              <w:t xml:space="preserve"/>
+            </w:r>
+          </w:p>
+        </w:tc>
+        <w:tc>
+          <w:tcPr>
+            <w:tcW w:w="1200" w:type="dxa"/>
+            <w:noWrap/>
+          </w:tcPr>
+          <w:p>
+            <w:pPr/>
+            <w:r>
+              <w:rPr/>
+              <w:t xml:space="preserve"/>
+            </w:r>
+          </w:p>
+        </w:tc>
+        <w:tc>
+          <w:tcPr>
+            <w:tcW w:w="1200" w:type="dxa"/>
+            <w:noWrap/>
+          </w:tcPr>
+          <w:p>
+            <w:pPr/>
+            <w:r>
+              <w:rPr/>
+              <w:t xml:space="preserve"/>
+            </w:r>
+          </w:p>
+        </w:tc>
+        <w:tc>
+          <w:tcPr>
+            <w:tcW w:w="900" w:type="dxa"/>
+            <w:noWrap/>
+          </w:tcPr>
+          <w:p>
+            <w:pPr>
+              <w:jc w:val="center"/>
+            </w:pPr>
+            <w:r>
+              <w:rPr/>
+              <w:t xml:space="preserve">3</w:t>
+            </w:r>
+          </w:p>
+        </w:tc>
+        <w:tc>
+          <w:tcPr>
+            <w:tcW w:w="2600" w:type="dxa"/>
+            <w:noWrap/>
+          </w:tcPr>
+          <w:p>
+            <w:pPr/>
+            <w:r>
+              <w:rPr/>
+              <w:t xml:space="preserve">Dr. Rahmiyati, M.A.P</w:t>
+            </w:r>
+          </w:p>
+        </w:tc>
+      </w:tr>
+      <w:tr>
+        <w:trPr/>
+        <w:tc>
+          <w:tcPr>
+            <w:tcW w:w="900" w:type="dxa"/>
+            <w:noWrap/>
+          </w:tcPr>
+          <w:p>
+            <w:pPr/>
+            <w:r>
+              <w:rPr/>
+              <w:t xml:space="preserve"/>
+            </w:r>
+          </w:p>
+        </w:tc>
+        <w:tc>
+          <w:tcPr>
+            <w:tcW w:w="5400" w:type="dxa"/>
+            <w:noWrap/>
+          </w:tcPr>
+          <w:p>
+            <w:pPr/>
+            <w:r>
+              <w:rPr/>
+              <w:t xml:space="preserve"/>
+            </w:r>
+          </w:p>
+        </w:tc>
+        <w:tc>
+          <w:tcPr>
+            <w:tcW w:w="1200" w:type="dxa"/>
+            <w:noWrap/>
+          </w:tcPr>
+          <w:p>
+            <w:pPr/>
+            <w:r>
+              <w:rPr/>
+              <w:t xml:space="preserve"/>
+            </w:r>
+          </w:p>
+        </w:tc>
+        <w:tc>
+          <w:tcPr>
+            <w:tcW w:w="1200" w:type="dxa"/>
+            <w:noWrap/>
+          </w:tcPr>
+          <w:p>
+            <w:pPr/>
+            <w:r>
+              <w:rPr/>
+              <w:t xml:space="preserve"/>
+            </w:r>
+          </w:p>
+        </w:tc>
+        <w:tc>
+          <w:tcPr>
+            <w:tcW w:w="900" w:type="dxa"/>
+            <w:noWrap/>
+          </w:tcPr>
+          <w:p>
+            <w:pPr>
+              <w:jc w:val="center"/>
+            </w:pPr>
+            <w:r>
+              <w:rPr/>
+              <w:t xml:space="preserve">4</w:t>
+            </w:r>
+          </w:p>
+        </w:tc>
+        <w:tc>
+          <w:tcPr>
+            <w:tcW w:w="2600" w:type="dxa"/>
+            <w:noWrap/>
+          </w:tcPr>
+          <w:p>
+            <w:pPr/>
+            <w:r>
+              <w:rPr/>
+              <w:t xml:space="preserve">Hj, Djubaidah, S.Ag., M.Pd</w:t>
+            </w:r>
+          </w:p>
+        </w:tc>
+      </w:tr>
+      <w:tr>
+        <w:trPr/>
+        <w:tc>
+          <w:tcPr>
+            <w:tcW w:w="900" w:type="dxa"/>
+            <w:noWrap/>
+          </w:tcPr>
+          <w:p>
+            <w:pPr>
+              <w:jc w:val="center"/>
+            </w:pPr>
+            <w:r>
+              <w:rPr/>
+              <w:t xml:space="preserve">6</w:t>
+            </w:r>
+          </w:p>
+        </w:tc>
+        <w:tc>
+          <w:tcPr>
+            <w:tcW w:w="5400" w:type="dxa"/>
+            <w:noWrap/>
+          </w:tcPr>
+          <w:p>
+            <w:pPr/>
+            <w:r>
+              <w:rPr/>
+              <w:t xml:space="preserve">Agenda 2: Nilai-Nilai Dasar PNS</w:t>
+            </w:r>
+          </w:p>
+        </w:tc>
+        <w:tc>
+          <w:tcPr>
+            <w:tcW w:w="1200" w:type="dxa"/>
+            <w:noWrap/>
+          </w:tcPr>
+          <w:p>
+            <w:pPr>
+              <w:jc w:val="center"/>
+            </w:pPr>
+            <w:r>
+              <w:rPr/>
+              <w:t xml:space="preserve">28</w:t>
+            </w:r>
+          </w:p>
+        </w:tc>
+        <w:tc>
+          <w:tcPr>
+            <w:tcW w:w="1200" w:type="dxa"/>
+            <w:noWrap/>
+          </w:tcPr>
+          <w:p>
+            <w:pPr>
+              <w:jc w:val="center"/>
+            </w:pPr>
+            <w:r>
+              <w:rPr/>
+              <w:t xml:space="preserve">14</w:t>
+            </w:r>
+          </w:p>
+        </w:tc>
+        <w:tc>
+          <w:tcPr>
+            <w:tcW w:w="900" w:type="dxa"/>
+            <w:noWrap/>
+          </w:tcPr>
+          <w:p>
+            <w:pPr>
+              <w:jc w:val="center"/>
+            </w:pPr>
+            <w:r>
+              <w:rPr/>
+              <w:t xml:space="preserve">1</w:t>
+            </w:r>
+          </w:p>
+        </w:tc>
+        <w:tc>
+          <w:tcPr>
+            <w:tcW w:w="2600" w:type="dxa"/>
+            <w:noWrap/>
+          </w:tcPr>
+          <w:p>
+            <w:pPr/>
+            <w:r>
+              <w:rPr/>
+              <w:t xml:space="preserve">Devi Yonesi, SE, M.AP.</w:t>
+            </w:r>
+          </w:p>
+        </w:tc>
+      </w:tr>
+      <w:tr>
+        <w:trPr/>
+        <w:tc>
+          <w:tcPr>
+            <w:tcW w:w="900" w:type="dxa"/>
+            <w:noWrap/>
+          </w:tcPr>
+          <w:p>
+            <w:pPr/>
+            <w:r>
+              <w:rPr/>
+              <w:t xml:space="preserve"/>
+            </w:r>
+          </w:p>
+        </w:tc>
+        <w:tc>
+          <w:tcPr>
+            <w:tcW w:w="5400" w:type="dxa"/>
+            <w:noWrap/>
+          </w:tcPr>
+          <w:p>
+            <w:pPr/>
+            <w:r>
+              <w:rPr/>
+              <w:t xml:space="preserve"/>
+            </w:r>
+          </w:p>
+        </w:tc>
+        <w:tc>
+          <w:tcPr>
+            <w:tcW w:w="1200" w:type="dxa"/>
+            <w:noWrap/>
+          </w:tcPr>
+          <w:p>
+            <w:pPr/>
+            <w:r>
+              <w:rPr/>
+              <w:t xml:space="preserve"/>
+            </w:r>
+          </w:p>
+        </w:tc>
+        <w:tc>
+          <w:tcPr>
+            <w:tcW w:w="1200" w:type="dxa"/>
+            <w:noWrap/>
+          </w:tcPr>
+          <w:p>
+            <w:pPr/>
+            <w:r>
+              <w:rPr/>
+              <w:t xml:space="preserve"/>
+            </w:r>
+          </w:p>
+        </w:tc>
+        <w:tc>
+          <w:tcPr>
+            <w:tcW w:w="900" w:type="dxa"/>
+            <w:noWrap/>
+          </w:tcPr>
+          <w:p>
+            <w:pPr>
+              <w:jc w:val="center"/>
+            </w:pPr>
+            <w:r>
+              <w:rPr/>
+              <w:t xml:space="preserve">2</w:t>
+            </w:r>
+          </w:p>
+        </w:tc>
+        <w:tc>
+          <w:tcPr>
+            <w:tcW w:w="2600" w:type="dxa"/>
+            <w:noWrap/>
+          </w:tcPr>
+          <w:p>
+            <w:pPr/>
+            <w:r>
+              <w:rPr/>
+              <w:t xml:space="preserve">Dr. H. Griven Herrie Putera, S.Ag.,M.Ag.</w:t>
+            </w:r>
+          </w:p>
+        </w:tc>
+      </w:tr>
+      <w:tr>
+        <w:trPr/>
+        <w:tc>
+          <w:tcPr>
+            <w:tcW w:w="900" w:type="dxa"/>
+            <w:noWrap/>
+          </w:tcPr>
+          <w:p>
+            <w:pPr>
+              <w:jc w:val="center"/>
+            </w:pPr>
+            <w:r>
+              <w:rPr/>
+              <w:t xml:space="preserve">7</w:t>
+            </w:r>
+          </w:p>
+        </w:tc>
+        <w:tc>
+          <w:tcPr>
+            <w:tcW w:w="5400" w:type="dxa"/>
+            <w:noWrap/>
+          </w:tcPr>
+          <w:p>
+            <w:pPr/>
+            <w:r>
+              <w:rPr/>
+              <w:t xml:space="preserve">Core Values  dan Employer Branding  ASN</w:t>
+            </w:r>
+          </w:p>
+        </w:tc>
+        <w:tc>
+          <w:tcPr>
+            <w:tcW w:w="1200" w:type="dxa"/>
+            <w:noWrap/>
+          </w:tcPr>
+          <w:p>
+            <w:pPr>
+              <w:jc w:val="center"/>
+            </w:pPr>
+            <w:r>
+              <w:rPr/>
+              <w:t xml:space="preserve">0</w:t>
+            </w:r>
+          </w:p>
+        </w:tc>
+        <w:tc>
+          <w:tcPr>
+            <w:tcW w:w="1200" w:type="dxa"/>
+            <w:noWrap/>
+          </w:tcPr>
+          <w:p>
+            <w:pPr>
+              <w:jc w:val="center"/>
+            </w:pPr>
+            <w:r>
+              <w:rPr/>
+              <w:t xml:space="preserve">2</w:t>
+            </w:r>
+          </w:p>
+        </w:tc>
+        <w:tc>
+          <w:tcPr>
+            <w:tcW w:w="900" w:type="dxa"/>
+            <w:noWrap/>
+          </w:tcPr>
+          <w:p>
+            <w:pPr>
+              <w:jc w:val="center"/>
+            </w:pPr>
+            <w:r>
+              <w:rPr/>
+              <w:t xml:space="preserve"/>
+            </w:r>
+          </w:p>
+        </w:tc>
+        <w:tc>
+          <w:tcPr>
+            <w:tcW w:w="2600" w:type="dxa"/>
+            <w:noWrap/>
+          </w:tcPr>
+          <w:p>
+            <w:pPr/>
+            <w:r>
+              <w:rPr/>
+              <w:t xml:space="preserve">H. Aprianto S.Ag., M.A..</w:t>
             </w:r>
           </w:p>
         </w:tc>
@@ -5586,7 +6274,7 @@
           <w:sz w:val="24"/>
           <w:szCs w:val="24"/>
         </w:rPr>
-        <w:t xml:space="preserve">Adapun panitia Pelatihan Dasar CPNS Golongan III Angkatan I berjumlah 4 orang dengan rincian sebagai berikut:</w:t>
+        <w:t xml:space="preserve">Adapun panitia {namaKegiatan} berjumlah 4 orang dengan rincian sebagai berikut:</w:t>
       </w:r>
     </w:p>
     <w:tbl>
@@ -5780,7 +6468,7 @@
             </w:pPr>
             <w:r>
               <w:rPr/>
-              <w:t xml:space="preserve">Eko Oktaviadi, S.H.</w:t>
+              <w:t xml:space="preserve">Suryandi, S.IP</w:t>
             </w:r>
           </w:p>
         </w:tc>
@@ -5795,7 +6483,7 @@
             </w:pPr>
             <w:r>
               <w:rPr/>
-              <w:t xml:space="preserve">198210282009121005</w:t>
+              <w:t xml:space="preserve">198107282009011018</w:t>
             </w:r>
           </w:p>
         </w:tc>
@@ -5843,7 +6531,7 @@
             </w:pPr>
             <w:r>
               <w:rPr/>
-              <w:t xml:space="preserve">Aryati, S.Pd.I</w:t>
+              <w:t xml:space="preserve">Zulhendri</w:t>
             </w:r>
           </w:p>
         </w:tc>
@@ -5858,7 +6546,7 @@
             </w:pPr>
             <w:r>
               <w:rPr/>
-              <w:t xml:space="preserve">198112252005012025</w:t>
+              <w:t xml:space="preserve">197710052009011015</w:t>
             </w:r>
           </w:p>
         </w:tc>
@@ -5906,7 +6594,7 @@
             </w:pPr>
             <w:r>
               <w:rPr/>
-              <w:t xml:space="preserve">Lani Clara Refiarika, A. Md</w:t>
+              <w:t xml:space="preserve">Nur Aisyah, S.Sos</w:t>
             </w:r>
           </w:p>
         </w:tc>
@@ -5921,7 +6609,7 @@
             </w:pPr>
             <w:r>
               <w:rPr/>
-              <w:t xml:space="preserve"/>
+              <w:t xml:space="preserve">199512212024212042</w:t>
             </w:r>
           </w:p>
         </w:tc>
@@ -5969,7 +6657,7 @@
             </w:pPr>
             <w:r>
               <w:rPr/>
-              <w:t xml:space="preserve">Ruth Yessifa Manalu, S.Si</w:t>
+              <w:t xml:space="preserve">Risti Atika Imani, S.Si</w:t>
             </w:r>
           </w:p>
         </w:tc>
@@ -5984,7 +6672,7 @@
             </w:pPr>
             <w:r>
               <w:rPr/>
-              <w:t xml:space="preserve">199509262024212036</w:t>
+              <w:t xml:space="preserve">199903072024212022</w:t>
             </w:r>
           </w:p>
         </w:tc>
@@ -6812,19 +7500,413 @@
           <w:sz w:val="24"/>
           <w:szCs w:val="24"/>
         </w:rPr>
-        <w:t xml:space="preserve">Hasil evaluasi peserta menunjukkan bahwa dari 40 peserta Latsar CPNS Angkatan 1, sebanyak 38 peserta (95%) dinyatakan lulus dengan nilai rata-rata 85, sedangkan 2 peserta (5%) dinyatakan tidak lulus dan harus mengulang pada tahapan tertentu sesuai dengan ketentuan yang berlaku.</w:t>
-      </w:r>
-    </w:p>
-    <w:p>
-      <w:pPr>
-        <w:pStyle w:val="Heading2"/>
-      </w:pPr>
-      <w:bookmarkStart w:id="18" w:name="_Toc18"/>
-      <w:r>
-        <w:t>5.2 Evaluasi Penyelenggaraan</w:t>
-      </w:r>
-      <w:bookmarkEnd w:id="18"/>
-    </w:p>
+        <w:t xml:space="preserve">Berdasarkan hasil Rapat Kelulusan oleh Tim Kelulusan Peserta Pelatihan Dasar CPNS Angkatan I yang dilaksanakan pada hari Rabu, 3 September 2025, didapatkan hasil sebagai berikut :</w:t>
+      </w:r>
+    </w:p>
+    <w:tbl>
+      <w:tblGrid>
+        <w:gridCol w:w="900" w:type="dxa"/>
+        <w:gridCol w:w="3000" w:type="dxa"/>
+        <w:gridCol w:w="2200" w:type="dxa"/>
+        <w:gridCol w:w="2000" w:type="dxa"/>
+      </w:tblGrid>
+      <w:tblPr>
+        <w:tblW w:w="0" w:type="auto"/>
+        <w:tblLayout w:type="autofit"/>
+        <w:tblCellMar>
+          <w:top w:w="50" w:type="dxa"/>
+          <w:left w:w="50" w:type="dxa"/>
+          <w:right w:w="50" w:type="dxa"/>
+          <w:bottom w:w="50" w:type="dxa"/>
+        </w:tblCellMar>
+        <w:tblBorders>
+          <w:top w:val="single" w:sz="6" w:color="000000"/>
+          <w:left w:val="single" w:sz="6" w:color="000000"/>
+          <w:right w:val="single" w:sz="6" w:color="000000"/>
+          <w:bottom w:val="single" w:sz="6" w:color="000000"/>
+          <w:insideH w:val="single" w:sz="6" w:color="000000"/>
+          <w:insideV w:val="single" w:sz="6" w:color="000000"/>
+        </w:tblBorders>
+      </w:tblPr>
+      <w:tr>
+        <w:trPr/>
+        <w:tc>
+          <w:tcPr>
+            <w:tcW w:w="900" w:type="dxa"/>
+            <w:noWrap/>
+          </w:tcPr>
+          <w:p>
+            <w:pPr>
+              <w:jc w:val="center"/>
+            </w:pPr>
+            <w:r>
+              <w:rPr>
+                <w:b w:val="1"/>
+                <w:bCs w:val="1"/>
+              </w:rPr>
+              <w:t xml:space="preserve">No</w:t>
+            </w:r>
+          </w:p>
+        </w:tc>
+        <w:tc>
+          <w:tcPr>
+            <w:tcW w:w="3000" w:type="dxa"/>
+            <w:noWrap/>
+          </w:tcPr>
+          <w:p>
+            <w:pPr/>
+            <w:r>
+              <w:rPr>
+                <w:b w:val="1"/>
+                <w:bCs w:val="1"/>
+              </w:rPr>
+              <w:t xml:space="preserve">Predikat</w:t>
+            </w:r>
+          </w:p>
+        </w:tc>
+        <w:tc>
+          <w:tcPr>
+            <w:tcW w:w="2200" w:type="dxa"/>
+            <w:noWrap/>
+          </w:tcPr>
+          <w:p>
+            <w:pPr>
+              <w:jc w:val="center"/>
+            </w:pPr>
+            <w:r>
+              <w:rPr>
+                <w:b w:val="1"/>
+                <w:bCs w:val="1"/>
+              </w:rPr>
+              <w:t xml:space="preserve">Rentang Nilai</w:t>
+            </w:r>
+          </w:p>
+        </w:tc>
+        <w:tc>
+          <w:tcPr>
+            <w:tcW w:w="2000" w:type="dxa"/>
+            <w:noWrap/>
+          </w:tcPr>
+          <w:p>
+            <w:pPr>
+              <w:jc w:val="center"/>
+            </w:pPr>
+            <w:r>
+              <w:rPr>
+                <w:b w:val="1"/>
+                <w:bCs w:val="1"/>
+              </w:rPr>
+              <w:t xml:space="preserve">Jumlah Peserta</w:t>
+            </w:r>
+          </w:p>
+        </w:tc>
+      </w:tr>
+      <w:tr>
+        <w:trPr/>
+        <w:tc>
+          <w:tcPr>
+            <w:tcW w:w="900" w:type="dxa"/>
+            <w:noWrap/>
+          </w:tcPr>
+          <w:p>
+            <w:pPr>
+              <w:jc w:val="center"/>
+            </w:pPr>
+            <w:r>
+              <w:rPr/>
+              <w:t xml:space="preserve">1</w:t>
+            </w:r>
+          </w:p>
+        </w:tc>
+        <w:tc>
+          <w:tcPr>
+            <w:tcW w:w="3000" w:type="dxa"/>
+            <w:noWrap/>
+          </w:tcPr>
+          <w:p>
+            <w:pPr/>
+            <w:r>
+              <w:rPr/>
+              <w:t xml:space="preserve">Sangat Memuaskan</w:t>
+            </w:r>
+          </w:p>
+        </w:tc>
+        <w:tc>
+          <w:tcPr>
+            <w:tcW w:w="2200" w:type="dxa"/>
+            <w:noWrap/>
+          </w:tcPr>
+          <w:p>
+            <w:pPr>
+              <w:jc w:val="center"/>
+            </w:pPr>
+            <w:r>
+              <w:rPr/>
+              <w:t xml:space="preserve">90,01 – 100</w:t>
+            </w:r>
+          </w:p>
+        </w:tc>
+        <w:tc>
+          <w:tcPr>
+            <w:tcW w:w="2000" w:type="dxa"/>
+            <w:noWrap/>
+          </w:tcPr>
+          <w:p>
+            <w:pPr>
+              <w:jc w:val="center"/>
+            </w:pPr>
+            <w:r>
+              <w:rPr/>
+              <w:t xml:space="preserve">36</w:t>
+            </w:r>
+          </w:p>
+        </w:tc>
+      </w:tr>
+      <w:tr>
+        <w:trPr/>
+        <w:tc>
+          <w:tcPr>
+            <w:tcW w:w="900" w:type="dxa"/>
+            <w:noWrap/>
+          </w:tcPr>
+          <w:p>
+            <w:pPr>
+              <w:jc w:val="center"/>
+            </w:pPr>
+            <w:r>
+              <w:rPr/>
+              <w:t xml:space="preserve">2</w:t>
+            </w:r>
+          </w:p>
+        </w:tc>
+        <w:tc>
+          <w:tcPr>
+            <w:tcW w:w="3000" w:type="dxa"/>
+            <w:noWrap/>
+          </w:tcPr>
+          <w:p>
+            <w:pPr/>
+            <w:r>
+              <w:rPr/>
+              <w:t xml:space="preserve">Memuaskan</w:t>
+            </w:r>
+          </w:p>
+        </w:tc>
+        <w:tc>
+          <w:tcPr>
+            <w:tcW w:w="2200" w:type="dxa"/>
+            <w:noWrap/>
+          </w:tcPr>
+          <w:p>
+            <w:pPr>
+              <w:jc w:val="center"/>
+            </w:pPr>
+            <w:r>
+              <w:rPr/>
+              <w:t xml:space="preserve">80,01 – 90,00</w:t>
+            </w:r>
+          </w:p>
+        </w:tc>
+        <w:tc>
+          <w:tcPr>
+            <w:tcW w:w="2000" w:type="dxa"/>
+            <w:noWrap/>
+          </w:tcPr>
+          <w:p>
+            <w:pPr>
+              <w:jc w:val="center"/>
+            </w:pPr>
+            <w:r>
+              <w:rPr/>
+              <w:t xml:space="preserve">4</w:t>
+            </w:r>
+          </w:p>
+        </w:tc>
+      </w:tr>
+      <w:tr>
+        <w:trPr/>
+        <w:tc>
+          <w:tcPr>
+            <w:tcW w:w="900" w:type="dxa"/>
+            <w:noWrap/>
+          </w:tcPr>
+          <w:p>
+            <w:pPr>
+              <w:jc w:val="center"/>
+            </w:pPr>
+            <w:r>
+              <w:rPr/>
+              <w:t xml:space="preserve">3</w:t>
+            </w:r>
+          </w:p>
+        </w:tc>
+        <w:tc>
+          <w:tcPr>
+            <w:tcW w:w="3000" w:type="dxa"/>
+            <w:noWrap/>
+          </w:tcPr>
+          <w:p>
+            <w:pPr/>
+            <w:r>
+              <w:rPr/>
+              <w:t xml:space="preserve">Cukup Memuaskan</w:t>
+            </w:r>
+          </w:p>
+        </w:tc>
+        <w:tc>
+          <w:tcPr>
+            <w:tcW w:w="2200" w:type="dxa"/>
+            <w:noWrap/>
+          </w:tcPr>
+          <w:p>
+            <w:pPr>
+              <w:jc w:val="center"/>
+            </w:pPr>
+            <w:r>
+              <w:rPr/>
+              <w:t xml:space="preserve">70,01 – 80,00</w:t>
+            </w:r>
+          </w:p>
+        </w:tc>
+        <w:tc>
+          <w:tcPr>
+            <w:tcW w:w="2000" w:type="dxa"/>
+            <w:noWrap/>
+          </w:tcPr>
+          <w:p>
+            <w:pPr>
+              <w:jc w:val="center"/>
+            </w:pPr>
+            <w:r>
+              <w:rPr/>
+              <w:t xml:space="preserve">0</w:t>
+            </w:r>
+          </w:p>
+        </w:tc>
+      </w:tr>
+      <w:tr>
+        <w:trPr/>
+        <w:tc>
+          <w:tcPr>
+            <w:tcW w:w="900" w:type="dxa"/>
+            <w:noWrap/>
+          </w:tcPr>
+          <w:p>
+            <w:pPr>
+              <w:jc w:val="center"/>
+            </w:pPr>
+            <w:r>
+              <w:rPr/>
+              <w:t xml:space="preserve">4</w:t>
+            </w:r>
+          </w:p>
+        </w:tc>
+        <w:tc>
+          <w:tcPr>
+            <w:tcW w:w="3000" w:type="dxa"/>
+            <w:noWrap/>
+          </w:tcPr>
+          <w:p>
+            <w:pPr/>
+            <w:r>
+              <w:rPr/>
+              <w:t xml:space="preserve">Ditunda Kelulusannya</w:t>
+            </w:r>
+          </w:p>
+        </w:tc>
+        <w:tc>
+          <w:tcPr>
+            <w:tcW w:w="2200" w:type="dxa"/>
+            <w:noWrap/>
+          </w:tcPr>
+          <w:p>
+            <w:pPr>
+              <w:jc w:val="center"/>
+            </w:pPr>
+            <w:r>
+              <w:rPr/>
+              <w:t xml:space="preserve">60,01 – 70,00</w:t>
+            </w:r>
+          </w:p>
+        </w:tc>
+        <w:tc>
+          <w:tcPr>
+            <w:tcW w:w="2000" w:type="dxa"/>
+            <w:noWrap/>
+          </w:tcPr>
+          <w:p>
+            <w:pPr>
+              <w:jc w:val="center"/>
+            </w:pPr>
+            <w:r>
+              <w:rPr/>
+              <w:t xml:space="preserve">0</w:t>
+            </w:r>
+          </w:p>
+        </w:tc>
+      </w:tr>
+      <w:tr>
+        <w:trPr/>
+        <w:tc>
+          <w:tcPr>
+            <w:tcW w:w="900" w:type="dxa"/>
+            <w:noWrap/>
+          </w:tcPr>
+          <w:p>
+            <w:pPr>
+              <w:jc w:val="center"/>
+            </w:pPr>
+            <w:r>
+              <w:rPr/>
+              <w:t xml:space="preserve">5</w:t>
+            </w:r>
+          </w:p>
+        </w:tc>
+        <w:tc>
+          <w:tcPr>
+            <w:tcW w:w="3000" w:type="dxa"/>
+            <w:noWrap/>
+          </w:tcPr>
+          <w:p>
+            <w:pPr/>
+            <w:r>
+              <w:rPr/>
+              <w:t xml:space="preserve">Tidak Memuaskan</w:t>
+            </w:r>
+          </w:p>
+        </w:tc>
+        <w:tc>
+          <w:tcPr>
+            <w:tcW w:w="2200" w:type="dxa"/>
+            <w:noWrap/>
+          </w:tcPr>
+          <w:p>
+            <w:pPr>
+              <w:jc w:val="center"/>
+            </w:pPr>
+            <w:r>
+              <w:rPr/>
+              <w:t xml:space="preserve">≤ 60,00</w:t>
+            </w:r>
+          </w:p>
+        </w:tc>
+        <w:tc>
+          <w:tcPr>
+            <w:tcW w:w="2000" w:type="dxa"/>
+            <w:noWrap/>
+          </w:tcPr>
+          <w:p>
+            <w:pPr>
+              <w:jc w:val="center"/>
+            </w:pPr>
+            <w:r>
+              <w:rPr/>
+              <w:t xml:space="preserve">0</w:t>
+            </w:r>
+          </w:p>
+        </w:tc>
+      </w:tr>
+    </w:tbl>
     <w:p>
       <w:pPr>
         <w:jc w:val="both"/>
@@ -6837,7 +7919,7 @@
           <w:sz w:val="24"/>
           <w:szCs w:val="24"/>
         </w:rPr>
-        <w:t xml:space="preserve">Evaluasi penyelenggaraan Latsar CPNS dilakukan untuk mengukur efektivitas dan efisiensi pelaksanaan pelatihan. Aspek yang dievaluasi meliputi:</w:t>
+        <w:t xml:space="preserve">Berdasarkan hasil Rapat Kelulusan oleh Tim Kelulusan Peserta Pelatihan Dasar CPNS Angkatan I yang dilaksanakan pada hari Rabu, 3 September 2025, diperoleh hasil sebagai berikut:</w:t>
       </w:r>
     </w:p>
     <w:p>
@@ -6853,7 +7935,7 @@
           <w:sz w:val="24"/>
           <w:szCs w:val="24"/>
         </w:rPr>
-        <w:t xml:space="preserve">Kesesuaian kurikulum dengan kebutuhan kompetensi peserta,</w:t>
+        <w:t xml:space="preserve">Jumlah peserta: 40 orang</w:t>
       </w:r>
     </w:p>
     <w:p>
@@ -6869,55 +7951,7 @@
           <w:sz w:val="24"/>
           <w:szCs w:val="24"/>
         </w:rPr>
-        <w:t xml:space="preserve">Kualitas tenaga pengajar dan fasilitator,</w:t>
-      </w:r>
-    </w:p>
-    <w:p>
-      <w:pPr>
-        <w:numPr>
-          <w:ilvl w:val="0"/>
-          <w:numId w:val="12"/>
-        </w:numPr>
-      </w:pPr>
-      <w:r>
-        <w:rPr>
-          <w:rFonts w:ascii="Times New Roman" w:hAnsi="Times New Roman" w:eastAsia="Times New Roman" w:cs="Times New Roman"/>
-          <w:sz w:val="24"/>
-          <w:szCs w:val="24"/>
-        </w:rPr>
-        <w:t xml:space="preserve">Ketersediaan dan kualitas sarana prasarana pembelajaran,</w:t>
-      </w:r>
-    </w:p>
-    <w:p>
-      <w:pPr>
-        <w:numPr>
-          <w:ilvl w:val="0"/>
-          <w:numId w:val="12"/>
-        </w:numPr>
-      </w:pPr>
-      <w:r>
-        <w:rPr>
-          <w:rFonts w:ascii="Times New Roman" w:hAnsi="Times New Roman" w:eastAsia="Times New Roman" w:cs="Times New Roman"/>
-          <w:sz w:val="24"/>
-          <w:szCs w:val="24"/>
-        </w:rPr>
-        <w:t xml:space="preserve">Kualitas materi dan metode pembelajaran,</w:t>
-      </w:r>
-    </w:p>
-    <w:p>
-      <w:pPr>
-        <w:numPr>
-          <w:ilvl w:val="0"/>
-          <w:numId w:val="12"/>
-        </w:numPr>
-      </w:pPr>
-      <w:r>
-        <w:rPr>
-          <w:rFonts w:ascii="Times New Roman" w:hAnsi="Times New Roman" w:eastAsia="Times New Roman" w:cs="Times New Roman"/>
-          <w:sz w:val="24"/>
-          <w:szCs w:val="24"/>
-        </w:rPr>
-        <w:t xml:space="preserve">Tingkat kepuasan peserta terhadap pelaksanaan pelatihan.</w:t>
+        <w:t xml:space="preserve">Status kelulusan: seluruh peserta dinyatakan LULUS</w:t>
       </w:r>
     </w:p>
     <w:p>
@@ -6932,92 +7966,8 @@
           <w:sz w:val="24"/>
           <w:szCs w:val="24"/>
         </w:rPr>
-        <w:t xml:space="preserve">Berdasarkan hasil evaluasi penyelenggaraan, secara umum pelaksanaan Latsar CPNS Angkatan 1 telah berjalan dengan baik dan sesuai dengan rencana. Tingkat kepuasan peserta terhadap kualitas pengajar, materi, dan fasilitas pelatihan mencapai rata-rata 4,5 dari skala 5. Beberapa rekomendasi perbaikan untuk penyelenggaraan pelatihan berikutnya antara lain:</w:t>
-      </w:r>
-    </w:p>
-    <w:p>
-      <w:pPr>
-        <w:numPr>
-          <w:ilvl w:val="0"/>
-          <w:numId w:val="12"/>
-        </w:numPr>
-      </w:pPr>
-      <w:r>
-        <w:rPr>
-          <w:rFonts w:ascii="Times New Roman" w:hAnsi="Times New Roman" w:eastAsia="Times New Roman" w:cs="Times New Roman"/>
-          <w:sz w:val="24"/>
-          <w:szCs w:val="24"/>
-        </w:rPr>
-        <w:t xml:space="preserve">Peningkatan kualitas jaringan internet untuk mendukung pembelajaran daring,</w:t>
-      </w:r>
-    </w:p>
-    <w:p>
-      <w:pPr>
-        <w:numPr>
-          <w:ilvl w:val="0"/>
-          <w:numId w:val="12"/>
-        </w:numPr>
-      </w:pPr>
-      <w:r>
-        <w:rPr>
-          <w:rFonts w:ascii="Times New Roman" w:hAnsi="Times New Roman" w:eastAsia="Times New Roman" w:cs="Times New Roman"/>
-          <w:sz w:val="24"/>
-          <w:szCs w:val="24"/>
-        </w:rPr>
-        <w:t xml:space="preserve">Optimalisasi pendampingan peserta dalam penyusunan rancangan aktualisasi,</w:t>
-      </w:r>
-    </w:p>
-    <w:p>
-      <w:pPr>
-        <w:numPr>
-          <w:ilvl w:val="0"/>
-          <w:numId w:val="12"/>
-        </w:numPr>
-      </w:pPr>
-      <w:r>
-        <w:rPr>
-          <w:rFonts w:ascii="Times New Roman" w:hAnsi="Times New Roman" w:eastAsia="Times New Roman" w:cs="Times New Roman"/>
-          <w:sz w:val="24"/>
-          <w:szCs w:val="24"/>
-        </w:rPr>
-        <w:t xml:space="preserve">Peningkatan koordinasi dengan instansi asal peserta untuk memastikan dukungan terhadap pelaksanaan aktualisasi.</w:t>
-      </w:r>
-    </w:p>
-    <w:p>
-      <w:r>
-        <w:br w:type="page"/>
-      </w:r>
-    </w:p>
-    <w:p>
-      <w:pPr>
-        <w:pStyle w:val="Heading1"/>
-      </w:pPr>
-      <w:bookmarkStart w:id="19" w:name="_Toc19"/>
-      <w:r>
-        <w:t>BAB VI</w:t>
-      </w:r>
-      <w:bookmarkEnd w:id="19"/>
-    </w:p>
-    <w:p>
-      <w:pPr>
-        <w:pStyle w:val="Heading1"/>
-      </w:pPr>
-      <w:bookmarkStart w:id="20" w:name="_Toc20"/>
-      <w:r>
-        <w:t>PENUTUP</w:t>
-      </w:r>
-      <w:bookmarkEnd w:id="20"/>
-    </w:p>
-    <w:p/>
-    <w:p>
-      <w:pPr>
-        <w:pStyle w:val="Heading2"/>
-      </w:pPr>
-      <w:bookmarkStart w:id="21" w:name="_Toc21"/>
-      <w:r>
-        <w:t>6.1 Kesimpulan</w:t>
-      </w:r>
-      <w:bookmarkEnd w:id="21"/>
+        <w:t xml:space="preserve">Kepada peserta yang telah menyelesaikan seluruh program dengan baik dan dinyatakan lulus, diberikan Surat Tanda Tamat Pelatihan (STTP). Hasil rekapitulasi evaluasi peserta terdapat pada lampiran. Selain itu, kepada peserta yang menempati 3 (tiga) peringkat terbaik, diberikan Piagam Penghargaan.</w:t>
+      </w:r>
     </w:p>
     <w:p>
       <w:pPr>
@@ -7031,7 +7981,7 @@
           <w:sz w:val="24"/>
           <w:szCs w:val="24"/>
         </w:rPr>
-        <w:t xml:space="preserve">Berdasarkan laporan penyelenggaraan Pelatihan Dasar Calon Pegawai Negeri Sipil (Latsar CPNS) Golongan III Angkatan 1 Tahun 2025 di wilayah kerja Loka Pendidikan dan Pelatihan Keagamaan Pekanbaru, dapat disimpulkan bahwa:</w:t>
+        <w:t xml:space="preserve">Adapun peserta Angkatan I yang memperoleh peringkat 3 besar adalah sebagai berikut:</w:t>
       </w:r>
     </w:p>
     <w:p>
@@ -7047,7 +7997,7 @@
           <w:sz w:val="24"/>
           <w:szCs w:val="24"/>
         </w:rPr>
-        <w:t xml:space="preserve">Pelaksanaan Latsar CPNS telah berjalan sesuai dengan rencana dan ketentuan yang berlaku, mulai dari tahap perencanaan, pelaksanaan, hingga evaluasi.</w:t>
+        <w:t xml:space="preserve">‌TARMIZI, M.A. – Peringkat I – Asisten Ahli</w:t>
       </w:r>
     </w:p>
     <w:p>
@@ -7063,7 +8013,7 @@
           <w:sz w:val="24"/>
           <w:szCs w:val="24"/>
         </w:rPr>
-        <w:t xml:space="preserve">Sebanyak 38 peserta (95%) dinyatakan lulus dan memenuhi kompetensi sebagai Calon Pegawai Negeri Sipil, sementara 2 peserta (5%) dinyatakan tidak lulus dan harus mengulang pada tahapan tertentu.</w:t>
+        <w:t xml:space="preserve">‌ARIEF BUDIMAN S.H.,M.H – Peringkat II – Asisten Ahli</w:t>
       </w:r>
     </w:p>
     <w:p>
@@ -7079,34 +8029,18 @@
           <w:sz w:val="24"/>
           <w:szCs w:val="24"/>
         </w:rPr>
-        <w:t xml:space="preserve">Seluruh rangkaian pelatihan, mulai dari MOOC, Distance Learning, Aktualisasi, hingga pembelajaran klasikal, telah dilaksanakan dengan efektif dan memberikan dampak positif terhadap pengembangan kompetensi peserta.</w:t>
-      </w:r>
-    </w:p>
-    <w:p>
-      <w:pPr>
-        <w:numPr>
-          <w:ilvl w:val="0"/>
-          <w:numId w:val="13"/>
-        </w:numPr>
-      </w:pPr>
-      <w:r>
-        <w:rPr>
-          <w:rFonts w:ascii="Times New Roman" w:hAnsi="Times New Roman" w:eastAsia="Times New Roman" w:cs="Times New Roman"/>
-          <w:sz w:val="24"/>
-          <w:szCs w:val="24"/>
-        </w:rPr>
-        <w:t xml:space="preserve">Tingkat kepuasan peserta terhadap kualitas pengajar, materi, dan fasilitas pelatihan mencapai rata-rata 4,5 dari skala 5, menunjukkan bahwa penyelenggaraan pelatihan telah memenuhi harapan peserta.</w:t>
+        <w:t xml:space="preserve">‌AGUNG KURNIAWAN, S.Kom. – Peringkat III – Pranata Komputer Ahli Pertama</w:t>
       </w:r>
     </w:p>
     <w:p>
       <w:pPr>
         <w:pStyle w:val="Heading2"/>
       </w:pPr>
-      <w:bookmarkStart w:id="22" w:name="_Toc22"/>
-      <w:r>
-        <w:t>6.2 Saran</w:t>
-      </w:r>
-      <w:bookmarkEnd w:id="22"/>
+      <w:bookmarkStart w:id="18" w:name="_Toc18"/>
+      <w:r>
+        <w:t>5.2 Evaluasi Penyelenggaraan</w:t>
+      </w:r>
+      <w:bookmarkEnd w:id="18"/>
     </w:p>
     <w:p>
       <w:pPr>
@@ -7120,7 +8054,7 @@
           <w:sz w:val="24"/>
           <w:szCs w:val="24"/>
         </w:rPr>
-        <w:t xml:space="preserve">Untuk meningkatkan kualitas penyelenggaraan Latsar CPNS pada tahun-tahun berikutnya, disampaikan beberapa saran sebagai berikut:</w:t>
+        <w:t xml:space="preserve">Evaluasi penyelenggaraan Latsar CPNS dilakukan untuk mengukur efektivitas dan efisiensi pelaksanaan pelatihan. Aspek yang dievaluasi meliputi:</w:t>
       </w:r>
     </w:p>
     <w:p>
@@ -7136,7 +8070,7 @@
           <w:sz w:val="24"/>
           <w:szCs w:val="24"/>
         </w:rPr>
-        <w:t xml:space="preserve">Perlu peningkatan kualitas jaringan internet dan dukungan teknis lainnya untuk memastikan kelancaran pembelajaran daring.</w:t>
+        <w:t xml:space="preserve">Kesesuaian kurikulum dengan kebutuhan kompetensi peserta,</w:t>
       </w:r>
     </w:p>
     <w:p>
@@ -7152,7 +8086,7 @@
           <w:sz w:val="24"/>
           <w:szCs w:val="24"/>
         </w:rPr>
-        <w:t xml:space="preserve">Diperlukan optimalisasi pendampingan peserta dalam penyusunan rancangan aktualisasi, termasuk peningkatan koordinasi dengan coach dan mentor.</w:t>
+        <w:t xml:space="preserve">Kualitas tenaga pengajar dan fasilitator,</w:t>
       </w:r>
     </w:p>
     <w:p>
@@ -7168,7 +8102,7 @@
           <w:sz w:val="24"/>
           <w:szCs w:val="24"/>
         </w:rPr>
-        <w:t xml:space="preserve">Perlu peningkatan koordinasi dengan instansi asal peserta untuk memastikan dukungan penuh terhadap pelaksanaan aktualisasi di tempat kerja.</w:t>
+        <w:t xml:space="preserve">Ketersediaan dan kualitas sarana prasarana pembelajaran,</w:t>
       </w:r>
     </w:p>
     <w:p>
@@ -7184,7 +8118,23 @@
           <w:sz w:val="24"/>
           <w:szCs w:val="24"/>
         </w:rPr>
-        <w:t xml:space="preserve">Diperlukan pengembangan materi pelatihan yang lebih kontekstual dan sesuai dengan kebutuhan peserta, termasuk penambahan studi kasus yang relevan dengan tugas dan fungsi instansi asal peserta.</w:t>
+        <w:t xml:space="preserve">Kualitas materi dan metode pembelajaran,</w:t>
+      </w:r>
+    </w:p>
+    <w:p>
+      <w:pPr>
+        <w:numPr>
+          <w:ilvl w:val="0"/>
+          <w:numId w:val="14"/>
+        </w:numPr>
+      </w:pPr>
+      <w:r>
+        <w:rPr>
+          <w:rFonts w:ascii="Times New Roman" w:hAnsi="Times New Roman" w:eastAsia="Times New Roman" w:cs="Times New Roman"/>
+          <w:sz w:val="24"/>
+          <w:szCs w:val="24"/>
+        </w:rPr>
+        <w:t xml:space="preserve">Tingkat kepuasan peserta terhadap pelaksanaan pelatihan.</w:t>
       </w:r>
     </w:p>
     <w:p>
@@ -7199,7 +8149,55 @@
           <w:sz w:val="24"/>
           <w:szCs w:val="24"/>
         </w:rPr>
-        <w:t xml:space="preserve">Dengan demikian, Latsar CPNS Golongan III Angkatan 1 Tahun 2025 telah berhasil dilaksanakan dan memberikan kontribusi positif terhadap pengembangan kompetensi Calon Pegawai Negeri Sipil di wilayah kerja Loka Pendidikan dan Pelatihan Keagamaan Pekanbaru.</w:t>
+        <w:t xml:space="preserve">Berdasarkan hasil evaluasi penyelenggaraan, secara umum pelaksanaan Latsar CPNS Angkatan 1 telah berjalan dengan baik dan sesuai dengan rencana. Tingkat kepuasan peserta terhadap kualitas pengajar, materi, dan fasilitas pelatihan mencapai rata-rata 4,5 dari skala 5. Beberapa rekomendasi perbaikan untuk penyelenggaraan pelatihan berikutnya antara lain:</w:t>
+      </w:r>
+    </w:p>
+    <w:p>
+      <w:pPr>
+        <w:numPr>
+          <w:ilvl w:val="0"/>
+          <w:numId w:val="14"/>
+        </w:numPr>
+      </w:pPr>
+      <w:r>
+        <w:rPr>
+          <w:rFonts w:ascii="Times New Roman" w:hAnsi="Times New Roman" w:eastAsia="Times New Roman" w:cs="Times New Roman"/>
+          <w:sz w:val="24"/>
+          <w:szCs w:val="24"/>
+        </w:rPr>
+        <w:t xml:space="preserve">Peningkatan kualitas jaringan internet untuk mendukung pembelajaran daring,</w:t>
+      </w:r>
+    </w:p>
+    <w:p>
+      <w:pPr>
+        <w:numPr>
+          <w:ilvl w:val="0"/>
+          <w:numId w:val="14"/>
+        </w:numPr>
+      </w:pPr>
+      <w:r>
+        <w:rPr>
+          <w:rFonts w:ascii="Times New Roman" w:hAnsi="Times New Roman" w:eastAsia="Times New Roman" w:cs="Times New Roman"/>
+          <w:sz w:val="24"/>
+          <w:szCs w:val="24"/>
+        </w:rPr>
+        <w:t xml:space="preserve">Optimalisasi pendampingan peserta dalam penyusunan rancangan aktualisasi,</w:t>
+      </w:r>
+    </w:p>
+    <w:p>
+      <w:pPr>
+        <w:numPr>
+          <w:ilvl w:val="0"/>
+          <w:numId w:val="14"/>
+        </w:numPr>
+      </w:pPr>
+      <w:r>
+        <w:rPr>
+          <w:rFonts w:ascii="Times New Roman" w:hAnsi="Times New Roman" w:eastAsia="Times New Roman" w:cs="Times New Roman"/>
+          <w:sz w:val="24"/>
+          <w:szCs w:val="24"/>
+        </w:rPr>
+        <w:t xml:space="preserve">Peningkatan koordinasi dengan instansi asal peserta untuk memastikan dukungan terhadap pelaksanaan aktualisasi.</w:t>
       </w:r>
     </w:p>
     <w:p>
@@ -7211,13 +8209,48 @@
       <w:pPr>
         <w:pStyle w:val="Heading1"/>
       </w:pPr>
-      <w:bookmarkStart w:id="23" w:name="_Toc23"/>
-      <w:r>
-        <w:t>LAMPIRAN-LAMPIRAN</w:t>
-      </w:r>
-      <w:bookmarkEnd w:id="23"/>
+      <w:bookmarkStart w:id="19" w:name="_Toc19"/>
+      <w:r>
+        <w:t>BAB VI</w:t>
+      </w:r>
+      <w:bookmarkEnd w:id="19"/>
+    </w:p>
+    <w:p>
+      <w:pPr>
+        <w:pStyle w:val="Heading1"/>
+      </w:pPr>
+      <w:bookmarkStart w:id="20" w:name="_Toc20"/>
+      <w:r>
+        <w:t>PENUTUP</w:t>
+      </w:r>
+      <w:bookmarkEnd w:id="20"/>
     </w:p>
     <w:p/>
+    <w:p>
+      <w:pPr>
+        <w:pStyle w:val="Heading2"/>
+      </w:pPr>
+      <w:bookmarkStart w:id="21" w:name="_Toc21"/>
+      <w:r>
+        <w:t>6.1 Kesimpulan</w:t>
+      </w:r>
+      <w:bookmarkEnd w:id="21"/>
+    </w:p>
+    <w:p>
+      <w:pPr>
+        <w:jc w:val="both"/>
+        <w:ind w:left="0" w:right="0" w:firstLine="700" w:hanging="0"/>
+        <w:spacing w:after="0" w:line="360" w:lineRule="auto"/>
+      </w:pPr>
+      <w:r>
+        <w:rPr>
+          <w:rFonts w:ascii="Times New Roman" w:hAnsi="Times New Roman" w:eastAsia="Times New Roman" w:cs="Times New Roman"/>
+          <w:sz w:val="24"/>
+          <w:szCs w:val="24"/>
+        </w:rPr>
+        <w:t xml:space="preserve">Berdasarkan laporan penyelenggaraan Pelatihan Dasar Calon Pegawai Negeri Sipil (Latsar CPNS) Golongan III Angkatan 1 Tahun 2025 di wilayah kerja Loka Pendidikan dan Pelatihan Keagamaan Pekanbaru, dapat disimpulkan bahwa:</w:t>
+      </w:r>
+    </w:p>
     <w:p>
       <w:pPr>
         <w:numPr>
@@ -7231,7 +8264,7 @@
           <w:sz w:val="24"/>
           <w:szCs w:val="24"/>
         </w:rPr>
-        <w:t xml:space="preserve">Surat Keputusan Penetapan Panitia Penyelenggara Latsar CPNS</w:t>
+        <w:t xml:space="preserve">Pelaksanaan Latsar CPNS telah berjalan sesuai dengan rencana dan ketentuan yang berlaku, mulai dari tahap perencanaan, pelaksanaan, hingga evaluasi.</w:t>
       </w:r>
     </w:p>
     <w:p>
@@ -7247,7 +8280,7 @@
           <w:sz w:val="24"/>
           <w:szCs w:val="24"/>
         </w:rPr>
-        <w:t xml:space="preserve">Surat Tugas Tenaga Pengajar</w:t>
+        <w:t xml:space="preserve">Sebanyak 38 peserta (95%) dinyatakan lulus dan memenuhi kompetensi sebagai Calon Pegawai Negeri Sipil, sementara 2 peserta (5%) dinyatakan tidak lulus dan harus mengulang pada tahapan tertentu.</w:t>
       </w:r>
     </w:p>
     <w:p>
@@ -7263,7 +8296,7 @@
           <w:sz w:val="24"/>
           <w:szCs w:val="24"/>
         </w:rPr>
-        <w:t xml:space="preserve">Daftar Hadir Peserta</w:t>
+        <w:t xml:space="preserve">Seluruh rangkaian pelatihan, mulai dari MOOC, Distance Learning, Aktualisasi, hingga pembelajaran klasikal, telah dilaksanakan dengan efektif dan memberikan dampak positif terhadap pengembangan kompetensi peserta.</w:t>
       </w:r>
     </w:p>
     <w:p>
@@ -7279,14 +8312,39 @@
           <w:sz w:val="24"/>
           <w:szCs w:val="24"/>
         </w:rPr>
-        <w:t xml:space="preserve">Daftar Nilai Peserta</w:t>
+        <w:t xml:space="preserve">Tingkat kepuasan peserta terhadap kualitas pengajar, materi, dan fasilitas pelatihan mencapai rata-rata 4,5 dari skala 5, menunjukkan bahwa penyelenggaraan pelatihan telah memenuhi harapan peserta.</w:t>
+      </w:r>
+    </w:p>
+    <w:p>
+      <w:pPr>
+        <w:pStyle w:val="Heading2"/>
+      </w:pPr>
+      <w:bookmarkStart w:id="22" w:name="_Toc22"/>
+      <w:r>
+        <w:t>6.2 Saran</w:t>
+      </w:r>
+      <w:bookmarkEnd w:id="22"/>
+    </w:p>
+    <w:p>
+      <w:pPr>
+        <w:jc w:val="both"/>
+        <w:ind w:left="0" w:right="0" w:firstLine="700" w:hanging="0"/>
+        <w:spacing w:after="0" w:line="360" w:lineRule="auto"/>
+      </w:pPr>
+      <w:r>
+        <w:rPr>
+          <w:rFonts w:ascii="Times New Roman" w:hAnsi="Times New Roman" w:eastAsia="Times New Roman" w:cs="Times New Roman"/>
+          <w:sz w:val="24"/>
+          <w:szCs w:val="24"/>
+        </w:rPr>
+        <w:t xml:space="preserve">Untuk meningkatkan kualitas penyelenggaraan Latsar CPNS pada tahun-tahun berikutnya, disampaikan beberapa saran sebagai berikut:</w:t>
       </w:r>
     </w:p>
     <w:p>
       <w:pPr>
         <w:numPr>
           <w:ilvl w:val="0"/>
-          <w:numId w:val="15"/>
+          <w:numId w:val="16"/>
         </w:numPr>
       </w:pPr>
       <w:r>
@@ -7295,14 +8353,14 @@
           <w:sz w:val="24"/>
           <w:szCs w:val="24"/>
         </w:rPr>
-        <w:t xml:space="preserve">Foto Dokumentasi Kegiatan</w:t>
+        <w:t xml:space="preserve">Perlu peningkatan kualitas jaringan internet dan dukungan teknis lainnya untuk memastikan kelancaran pembelajaran daring.</w:t>
       </w:r>
     </w:p>
     <w:p>
       <w:pPr>
         <w:numPr>
           <w:ilvl w:val="0"/>
-          <w:numId w:val="15"/>
+          <w:numId w:val="16"/>
         </w:numPr>
       </w:pPr>
       <w:r>
@@ -7311,14 +8369,14 @@
           <w:sz w:val="24"/>
           <w:szCs w:val="24"/>
         </w:rPr>
-        <w:t xml:space="preserve">Berita Acara Penyelenggaraan</w:t>
+        <w:t xml:space="preserve">Diperlukan optimalisasi pendampingan peserta dalam penyusunan rancangan aktualisasi, termasuk peningkatan koordinasi dengan coach dan mentor.</w:t>
       </w:r>
     </w:p>
     <w:p>
       <w:pPr>
         <w:numPr>
           <w:ilvl w:val="0"/>
-          <w:numId w:val="15"/>
+          <w:numId w:val="16"/>
         </w:numPr>
       </w:pPr>
       <w:r>
@@ -7327,14 +8385,173 @@
           <w:sz w:val="24"/>
           <w:szCs w:val="24"/>
         </w:rPr>
-        <w:t xml:space="preserve">Rekapitulasi Evaluasi Peserta</w:t>
+        <w:t xml:space="preserve">Perlu peningkatan koordinasi dengan instansi asal peserta untuk memastikan dukungan penuh terhadap pelaksanaan aktualisasi di tempat kerja.</w:t>
       </w:r>
     </w:p>
     <w:p>
       <w:pPr>
         <w:numPr>
           <w:ilvl w:val="0"/>
-          <w:numId w:val="15"/>
+          <w:numId w:val="16"/>
+        </w:numPr>
+      </w:pPr>
+      <w:r>
+        <w:rPr>
+          <w:rFonts w:ascii="Times New Roman" w:hAnsi="Times New Roman" w:eastAsia="Times New Roman" w:cs="Times New Roman"/>
+          <w:sz w:val="24"/>
+          <w:szCs w:val="24"/>
+        </w:rPr>
+        <w:t xml:space="preserve">Diperlukan pengembangan materi pelatihan yang lebih kontekstual dan sesuai dengan kebutuhan peserta, termasuk penambahan studi kasus yang relevan dengan tugas dan fungsi instansi asal peserta.</w:t>
+      </w:r>
+    </w:p>
+    <w:p>
+      <w:pPr>
+        <w:jc w:val="both"/>
+        <w:ind w:left="0" w:right="0" w:firstLine="700" w:hanging="0"/>
+        <w:spacing w:after="0" w:line="360" w:lineRule="auto"/>
+      </w:pPr>
+      <w:r>
+        <w:rPr>
+          <w:rFonts w:ascii="Times New Roman" w:hAnsi="Times New Roman" w:eastAsia="Times New Roman" w:cs="Times New Roman"/>
+          <w:sz w:val="24"/>
+          <w:szCs w:val="24"/>
+        </w:rPr>
+        <w:t xml:space="preserve">Dengan demikian, Latsar CPNS Golongan III Angkatan 1 Tahun 2025 telah berhasil dilaksanakan dan memberikan kontribusi positif terhadap pengembangan kompetensi Calon Pegawai Negeri Sipil di wilayah kerja Loka Pendidikan dan Pelatihan Keagamaan Pekanbaru.</w:t>
+      </w:r>
+    </w:p>
+    <w:p>
+      <w:r>
+        <w:br w:type="page"/>
+      </w:r>
+    </w:p>
+    <w:p>
+      <w:pPr>
+        <w:pStyle w:val="Heading1"/>
+      </w:pPr>
+      <w:bookmarkStart w:id="23" w:name="_Toc23"/>
+      <w:r>
+        <w:t>LAMPIRAN-LAMPIRAN</w:t>
+      </w:r>
+      <w:bookmarkEnd w:id="23"/>
+    </w:p>
+    <w:p/>
+    <w:p>
+      <w:pPr>
+        <w:numPr>
+          <w:ilvl w:val="0"/>
+          <w:numId w:val="17"/>
+        </w:numPr>
+      </w:pPr>
+      <w:r>
+        <w:rPr>
+          <w:rFonts w:ascii="Times New Roman" w:hAnsi="Times New Roman" w:eastAsia="Times New Roman" w:cs="Times New Roman"/>
+          <w:sz w:val="24"/>
+          <w:szCs w:val="24"/>
+        </w:rPr>
+        <w:t xml:space="preserve">Surat Keputusan Penetapan Panitia Penyelenggara Latsar CPNS</w:t>
+      </w:r>
+    </w:p>
+    <w:p>
+      <w:pPr>
+        <w:numPr>
+          <w:ilvl w:val="0"/>
+          <w:numId w:val="17"/>
+        </w:numPr>
+      </w:pPr>
+      <w:r>
+        <w:rPr>
+          <w:rFonts w:ascii="Times New Roman" w:hAnsi="Times New Roman" w:eastAsia="Times New Roman" w:cs="Times New Roman"/>
+          <w:sz w:val="24"/>
+          <w:szCs w:val="24"/>
+        </w:rPr>
+        <w:t xml:space="preserve">Surat Tugas Tenaga Pengajar</w:t>
+      </w:r>
+    </w:p>
+    <w:p>
+      <w:pPr>
+        <w:numPr>
+          <w:ilvl w:val="0"/>
+          <w:numId w:val="17"/>
+        </w:numPr>
+      </w:pPr>
+      <w:r>
+        <w:rPr>
+          <w:rFonts w:ascii="Times New Roman" w:hAnsi="Times New Roman" w:eastAsia="Times New Roman" w:cs="Times New Roman"/>
+          <w:sz w:val="24"/>
+          <w:szCs w:val="24"/>
+        </w:rPr>
+        <w:t xml:space="preserve">Daftar Hadir Peserta</w:t>
+      </w:r>
+    </w:p>
+    <w:p>
+      <w:pPr>
+        <w:numPr>
+          <w:ilvl w:val="0"/>
+          <w:numId w:val="17"/>
+        </w:numPr>
+      </w:pPr>
+      <w:r>
+        <w:rPr>
+          <w:rFonts w:ascii="Times New Roman" w:hAnsi="Times New Roman" w:eastAsia="Times New Roman" w:cs="Times New Roman"/>
+          <w:sz w:val="24"/>
+          <w:szCs w:val="24"/>
+        </w:rPr>
+        <w:t xml:space="preserve">Daftar Nilai Peserta</w:t>
+      </w:r>
+    </w:p>
+    <w:p>
+      <w:pPr>
+        <w:numPr>
+          <w:ilvl w:val="0"/>
+          <w:numId w:val="17"/>
+        </w:numPr>
+      </w:pPr>
+      <w:r>
+        <w:rPr>
+          <w:rFonts w:ascii="Times New Roman" w:hAnsi="Times New Roman" w:eastAsia="Times New Roman" w:cs="Times New Roman"/>
+          <w:sz w:val="24"/>
+          <w:szCs w:val="24"/>
+        </w:rPr>
+        <w:t xml:space="preserve">Foto Dokumentasi Kegiatan</w:t>
+      </w:r>
+    </w:p>
+    <w:p>
+      <w:pPr>
+        <w:numPr>
+          <w:ilvl w:val="0"/>
+          <w:numId w:val="17"/>
+        </w:numPr>
+      </w:pPr>
+      <w:r>
+        <w:rPr>
+          <w:rFonts w:ascii="Times New Roman" w:hAnsi="Times New Roman" w:eastAsia="Times New Roman" w:cs="Times New Roman"/>
+          <w:sz w:val="24"/>
+          <w:szCs w:val="24"/>
+        </w:rPr>
+        <w:t xml:space="preserve">Berita Acara Penyelenggaraan</w:t>
+      </w:r>
+    </w:p>
+    <w:p>
+      <w:pPr>
+        <w:numPr>
+          <w:ilvl w:val="0"/>
+          <w:numId w:val="17"/>
+        </w:numPr>
+      </w:pPr>
+      <w:r>
+        <w:rPr>
+          <w:rFonts w:ascii="Times New Roman" w:hAnsi="Times New Roman" w:eastAsia="Times New Roman" w:cs="Times New Roman"/>
+          <w:sz w:val="24"/>
+          <w:szCs w:val="24"/>
+        </w:rPr>
+        <w:t xml:space="preserve">Rekapitulasi Evaluasi Peserta</w:t>
+      </w:r>
+    </w:p>
+    <w:p>
+      <w:pPr>
+        <w:numPr>
+          <w:ilvl w:val="0"/>
+          <w:numId w:val="17"/>
         </w:numPr>
       </w:pPr>
       <w:r>
@@ -7385,7 +8602,7 @@
 <file path=word/numbering.xml><?xml version="1.0" encoding="utf-8"?>
 <w:numbering xmlns:ve="http://schemas.openxmlformats.org/markup-compatibility/2006" xmlns:o="urn:schemas-microsoft-com:office:office" xmlns:r="http://schemas.openxmlformats.org/officeDocument/2006/relationships" xmlns:m="http://schemas.openxmlformats.org/officeDocument/2006/math" xmlns:v="urn:schemas-microsoft-com:vml" xmlns:wp="http://schemas.openxmlformats.org/drawingml/2006/wordprocessingDrawing" xmlns:w10="urn:schemas-microsoft-com:office:word" xmlns:w="http://schemas.openxmlformats.org/wordprocessingml/2006/main" xmlns:wne="http://schemas.microsoft.com/office/word/2006/wordml">
   <w:abstractNum w:abstractNumId="4">
-    <w:nsid w:val="8EE387C6"/>
+    <w:nsid w:val="E60B0CE8"/>
     <w:multiLevelType w:val="multilevel"/>
     <w:lvl w:ilvl="0">
       <w:start w:val="1"/>
@@ -7404,7 +8621,7 @@
     </w:lvl>
   </w:abstractNum>
   <w:abstractNum w:abstractNumId="5">
-    <w:nsid w:val="BD462C42"/>
+    <w:nsid w:val="A8B1A3D1"/>
     <w:multiLevelType w:val="multilevel"/>
     <w:lvl w:ilvl="0">
       <w:start w:val="1"/>
@@ -7423,7 +8640,7 @@
     </w:lvl>
   </w:abstractNum>
   <w:abstractNum w:abstractNumId="6">
-    <w:nsid w:val="7566B6AD"/>
+    <w:nsid w:val="48C41AA1"/>
     <w:multiLevelType w:val="multilevel"/>
     <w:lvl w:ilvl="0">
       <w:start w:val="1"/>
@@ -7442,7 +8659,7 @@
     </w:lvl>
   </w:abstractNum>
   <w:abstractNum w:abstractNumId="7">
-    <w:nsid w:val="5BE736AD"/>
+    <w:nsid w:val="9A5F647C"/>
     <w:multiLevelType w:val="multilevel"/>
     <w:lvl w:ilvl="0">
       <w:start w:val="1"/>
@@ -7461,7 +8678,7 @@
     </w:lvl>
   </w:abstractNum>
   <w:abstractNum w:abstractNumId="8">
-    <w:nsid w:val="29D5D5DD"/>
+    <w:nsid w:val="9C4A1DA5"/>
     <w:multiLevelType w:val="multilevel"/>
     <w:lvl w:ilvl="0">
       <w:start w:val="1"/>
@@ -7480,7 +8697,7 @@
     </w:lvl>
   </w:abstractNum>
   <w:abstractNum w:abstractNumId="9">
-    <w:nsid w:val="B59FFAAA"/>
+    <w:nsid w:val="36517FBA"/>
     <w:multiLevelType w:val="multilevel"/>
     <w:lvl w:ilvl="0">
       <w:start w:val="1"/>
@@ -7499,7 +8716,7 @@
     </w:lvl>
   </w:abstractNum>
   <w:abstractNum w:abstractNumId="10">
-    <w:nsid w:val="321939A8"/>
+    <w:nsid w:val="F4BD8300"/>
     <w:multiLevelType w:val="multilevel"/>
     <w:lvl w:ilvl="0">
       <w:start w:val="1"/>
@@ -7518,7 +8735,7 @@
     </w:lvl>
   </w:abstractNum>
   <w:abstractNum w:abstractNumId="11">
-    <w:nsid w:val="73BF476F"/>
+    <w:nsid w:val="FD7A0332"/>
     <w:multiLevelType w:val="multilevel"/>
     <w:lvl w:ilvl="0">
       <w:start w:val="1"/>
@@ -7537,7 +8754,45 @@
     </w:lvl>
   </w:abstractNum>
   <w:abstractNum w:abstractNumId="12">
-    <w:nsid w:val="BB9E0AFE"/>
+    <w:nsid w:val="1E673768"/>
+    <w:multiLevelType w:val="multilevel"/>
+    <w:lvl w:ilvl="0">
+      <w:start w:val="1"/>
+      <w:numFmt w:val="bullet"/>
+      <w:suff w:val="tab"/>
+      <w:lvlText w:val="%1."/>
+      <w:pPr>
+        <w:tabs>
+          <w:tab w:val="num" w:pos="360"/>
+        </w:tabs>
+        <w:ind w:left="360" w:hanging="360"/>
+      </w:pPr>
+      <w:rPr>
+        <w:rFonts/>
+      </w:rPr>
+    </w:lvl>
+  </w:abstractNum>
+  <w:abstractNum w:abstractNumId="13">
+    <w:nsid w:val="AAAD86F5"/>
+    <w:multiLevelType w:val="multilevel"/>
+    <w:lvl w:ilvl="0">
+      <w:start w:val="1"/>
+      <w:numFmt w:val="decimal"/>
+      <w:suff w:val="tab"/>
+      <w:lvlText w:val="%1."/>
+      <w:pPr>
+        <w:tabs>
+          <w:tab w:val="num" w:pos="360"/>
+        </w:tabs>
+        <w:ind w:left="360" w:hanging="360"/>
+      </w:pPr>
+      <w:rPr>
+        <w:rFonts/>
+      </w:rPr>
+    </w:lvl>
+  </w:abstractNum>
+  <w:abstractNum w:abstractNumId="14">
+    <w:nsid w:val="5D67EFF7"/>
     <w:multiLevelType w:val="multilevel"/>
     <w:lvl w:ilvl="0">
       <w:start w:val="1"/>
@@ -7555,8 +8810,8 @@
       </w:rPr>
     </w:lvl>
   </w:abstractNum>
-  <w:abstractNum w:abstractNumId="13">
-    <w:nsid w:val="2AAB98DE"/>
+  <w:abstractNum w:abstractNumId="15">
+    <w:nsid w:val="8C590589"/>
     <w:multiLevelType w:val="multilevel"/>
     <w:lvl w:ilvl="0">
       <w:start w:val="1"/>
@@ -7574,8 +8829,8 @@
       </w:rPr>
     </w:lvl>
   </w:abstractNum>
-  <w:abstractNum w:abstractNumId="14">
-    <w:nsid w:val="B2B06492"/>
+  <w:abstractNum w:abstractNumId="16">
+    <w:nsid w:val="8AE62764"/>
     <w:multiLevelType w:val="multilevel"/>
     <w:lvl w:ilvl="0">
       <w:start w:val="1"/>
@@ -7593,8 +8848,8 @@
       </w:rPr>
     </w:lvl>
   </w:abstractNum>
-  <w:abstractNum w:abstractNumId="15">
-    <w:nsid w:val="0688B8CA"/>
+  <w:abstractNum w:abstractNumId="17">
+    <w:nsid w:val="B2F491B9"/>
     <w:multiLevelType w:val="multilevel"/>
     <w:lvl w:ilvl="0">
       <w:start w:val="1"/>
@@ -7647,6 +8902,12 @@
   </w:num>
   <w:num w:numId="15">
     <w:abstractNumId w:val="15"/>
+  </w:num>
+  <w:num w:numId="16">
+    <w:abstractNumId w:val="16"/>
+  </w:num>
+  <w:num w:numId="17">
+    <w:abstractNumId w:val="17"/>
   </w:num>
 </w:numbering>
 </file>

</xml_diff>